<commit_message>
Extend VI-H with the feature separation table
The section argued that the top retrieval score does not separate the
classes. That was true but narrower than the evidence supports: no
retrieval-side feature separates. Best AUC is 0.599 against a chance rate
of 0.500, and three of the five sit at 0.504-0.545.

The margin row is the one worth reading. It was the feature we expected
to work, the reasoning behind it was sound, and it holds in direction
(1.28 against 2.18) while failing in magnitude. Reporting a correct
prediction that is nonetheless useless is more informative than dropping
it.

Also states in advance that this bounds the calibrated combination, so
that if signal 4 underperforms it is read as a property of the feature
set rather than as a tuning failure.
</commit_message>
<xml_diff>
--- a/paper/IndicRAG-QA.docx
+++ b/paper/IndicRAG-QA.docx
@@ -8147,6 +8147,617 @@
           <w:sz w:val="20"/>
         </w:rPr>
         <w:t>The best F1 of 0.372 is reached at 86% abstention. Those two numbers have to be read together. A recall of 0.93 on the unanswerable class, bought by refusing most of the answerable questions as well, is not detection; it is silence.</w:t>
+      </w:r>
+    </w:p>
+    <w:p>
+      <w:pPr>
+        <w:spacing w:after="0"/>
+        <w:ind w:firstLine="288"/>
+        <w:jc w:val="both"/>
+      </w:pPr>
+      <w:r>
+        <w:rPr>
+          <w:rFonts w:ascii="Times New Roman" w:hAnsi="Times New Roman"/>
+          <w:sz w:val="20"/>
+        </w:rPr>
+        <w:t>The top score is the quantity a threshold uses, but it is not the only retrieval-side feature available, and the calibrated combination of §IV-F is fit over all of them. None of them separates either.</w:t>
+      </w:r>
+    </w:p>
+    <w:p>
+      <w:pPr>
+        <w:spacing w:after="0"/>
+        <w:ind w:firstLine="288"/>
+        <w:jc w:val="both"/>
+      </w:pPr>
+      <w:r>
+        <w:rPr>
+          <w:rFonts w:ascii="Times New Roman" w:hAnsi="Times New Roman"/>
+          <w:b/>
+          <w:sz w:val="20"/>
+        </w:rPr>
+        <w:t>Feature separation under BM25, all 400 items.</w:t>
+      </w:r>
+      <w:r>
+        <w:rPr>
+          <w:rFonts w:ascii="Times New Roman" w:hAnsi="Times New Roman"/>
+          <w:sz w:val="20"/>
+        </w:rPr>
+        <w:t xml:space="preserve"> AUC is P(a random answerable question scores above a random unanswerable one); 0.500 is chance.</w:t>
+      </w:r>
+    </w:p>
+    <w:tbl>
+      <w:tblPr>
+        <w:tblStyle w:val="TableGrid"/>
+        <w:tblW w:type="auto" w:w="0"/>
+        <w:tblLayout w:type="autofit"/>
+        <w:tblLook w:firstColumn="1" w:firstRow="1" w:lastColumn="0" w:lastRow="0" w:noHBand="0" w:noVBand="1" w:val="04A0"/>
+      </w:tblPr>
+      <w:tblGrid>
+        <w:gridCol w:w="2610"/>
+        <w:gridCol w:w="2610"/>
+        <w:gridCol w:w="2610"/>
+        <w:gridCol w:w="2610"/>
+      </w:tblGrid>
+      <w:tr>
+        <w:tc>
+          <w:tcPr>
+            <w:tcW w:type="dxa" w:w="2610"/>
+          </w:tcPr>
+          <w:p>
+            <w:pPr>
+              <w:spacing w:after="0"/>
+            </w:pPr>
+            <w:r/>
+            <w:r>
+              <w:rPr>
+                <w:rFonts w:ascii="Times New Roman" w:hAnsi="Times New Roman"/>
+                <w:b/>
+                <w:sz w:val="16"/>
+              </w:rPr>
+              <w:t>Feature</w:t>
+            </w:r>
+          </w:p>
+        </w:tc>
+        <w:tc>
+          <w:tcPr>
+            <w:tcW w:type="dxa" w:w="2610"/>
+          </w:tcPr>
+          <w:p>
+            <w:pPr>
+              <w:spacing w:after="0"/>
+            </w:pPr>
+            <w:r/>
+            <w:r>
+              <w:rPr>
+                <w:rFonts w:ascii="Times New Roman" w:hAnsi="Times New Roman"/>
+                <w:b/>
+                <w:sz w:val="16"/>
+              </w:rPr>
+              <w:t>answerable</w:t>
+            </w:r>
+          </w:p>
+        </w:tc>
+        <w:tc>
+          <w:tcPr>
+            <w:tcW w:type="dxa" w:w="2610"/>
+          </w:tcPr>
+          <w:p>
+            <w:pPr>
+              <w:spacing w:after="0"/>
+            </w:pPr>
+            <w:r/>
+            <w:r>
+              <w:rPr>
+                <w:rFonts w:ascii="Times New Roman" w:hAnsi="Times New Roman"/>
+                <w:b/>
+                <w:sz w:val="16"/>
+              </w:rPr>
+              <w:t>unanswerable</w:t>
+            </w:r>
+          </w:p>
+        </w:tc>
+        <w:tc>
+          <w:tcPr>
+            <w:tcW w:type="dxa" w:w="2610"/>
+          </w:tcPr>
+          <w:p>
+            <w:pPr>
+              <w:spacing w:after="0"/>
+            </w:pPr>
+            <w:r/>
+            <w:r>
+              <w:rPr>
+                <w:rFonts w:ascii="Times New Roman" w:hAnsi="Times New Roman"/>
+                <w:b/>
+                <w:sz w:val="16"/>
+              </w:rPr>
+              <w:t>AUC</w:t>
+            </w:r>
+          </w:p>
+        </w:tc>
+      </w:tr>
+      <w:tr>
+        <w:tc>
+          <w:tcPr>
+            <w:tcW w:type="dxa" w:w="2610"/>
+          </w:tcPr>
+          <w:p>
+            <w:pPr>
+              <w:spacing w:after="0"/>
+            </w:pPr>
+            <w:r>
+              <w:rPr>
+                <w:sz w:val="16"/>
+              </w:rPr>
+            </w:r>
+            <w:r>
+              <w:rPr>
+                <w:rFonts w:ascii="Times New Roman" w:hAnsi="Times New Roman"/>
+                <w:sz w:val="16"/>
+              </w:rPr>
+              <w:t>top1 − top2 margin</w:t>
+            </w:r>
+          </w:p>
+        </w:tc>
+        <w:tc>
+          <w:tcPr>
+            <w:tcW w:type="dxa" w:w="2610"/>
+          </w:tcPr>
+          <w:p>
+            <w:pPr>
+              <w:spacing w:after="0"/>
+            </w:pPr>
+            <w:r>
+              <w:rPr>
+                <w:sz w:val="16"/>
+              </w:rPr>
+            </w:r>
+            <w:r>
+              <w:rPr>
+                <w:rFonts w:ascii="Times New Roman" w:hAnsi="Times New Roman"/>
+                <w:sz w:val="16"/>
+              </w:rPr>
+              <w:t>2.1769</w:t>
+            </w:r>
+          </w:p>
+        </w:tc>
+        <w:tc>
+          <w:tcPr>
+            <w:tcW w:type="dxa" w:w="2610"/>
+          </w:tcPr>
+          <w:p>
+            <w:pPr>
+              <w:spacing w:after="0"/>
+            </w:pPr>
+            <w:r>
+              <w:rPr>
+                <w:sz w:val="16"/>
+              </w:rPr>
+            </w:r>
+            <w:r>
+              <w:rPr>
+                <w:rFonts w:ascii="Times New Roman" w:hAnsi="Times New Roman"/>
+                <w:sz w:val="16"/>
+              </w:rPr>
+              <w:t>1.2750</w:t>
+            </w:r>
+          </w:p>
+        </w:tc>
+        <w:tc>
+          <w:tcPr>
+            <w:tcW w:type="dxa" w:w="2610"/>
+          </w:tcPr>
+          <w:p>
+            <w:pPr>
+              <w:spacing w:after="0"/>
+            </w:pPr>
+            <w:r>
+              <w:rPr>
+                <w:sz w:val="16"/>
+              </w:rPr>
+            </w:r>
+            <w:r>
+              <w:rPr>
+                <w:rFonts w:ascii="Times New Roman" w:hAnsi="Times New Roman"/>
+                <w:sz w:val="16"/>
+              </w:rPr>
+              <w:t>0.594</w:t>
+            </w:r>
+          </w:p>
+        </w:tc>
+      </w:tr>
+      <w:tr>
+        <w:tc>
+          <w:tcPr>
+            <w:tcW w:type="dxa" w:w="2610"/>
+          </w:tcPr>
+          <w:p>
+            <w:pPr>
+              <w:spacing w:after="0"/>
+            </w:pPr>
+            <w:r>
+              <w:rPr>
+                <w:sz w:val="16"/>
+              </w:rPr>
+            </w:r>
+            <w:r>
+              <w:rPr>
+                <w:rFonts w:ascii="Times New Roman" w:hAnsi="Times New Roman"/>
+                <w:sz w:val="16"/>
+              </w:rPr>
+              <w:t>score spread (top1 − topK)</w:t>
+            </w:r>
+          </w:p>
+        </w:tc>
+        <w:tc>
+          <w:tcPr>
+            <w:tcW w:type="dxa" w:w="2610"/>
+          </w:tcPr>
+          <w:p>
+            <w:pPr>
+              <w:spacing w:after="0"/>
+            </w:pPr>
+            <w:r>
+              <w:rPr>
+                <w:sz w:val="16"/>
+              </w:rPr>
+            </w:r>
+            <w:r>
+              <w:rPr>
+                <w:rFonts w:ascii="Times New Roman" w:hAnsi="Times New Roman"/>
+                <w:sz w:val="16"/>
+              </w:rPr>
+              <w:t>5.2127</w:t>
+            </w:r>
+          </w:p>
+        </w:tc>
+        <w:tc>
+          <w:tcPr>
+            <w:tcW w:type="dxa" w:w="2610"/>
+          </w:tcPr>
+          <w:p>
+            <w:pPr>
+              <w:spacing w:after="0"/>
+            </w:pPr>
+            <w:r>
+              <w:rPr>
+                <w:sz w:val="16"/>
+              </w:rPr>
+            </w:r>
+            <w:r>
+              <w:rPr>
+                <w:rFonts w:ascii="Times New Roman" w:hAnsi="Times New Roman"/>
+                <w:sz w:val="16"/>
+              </w:rPr>
+              <w:t>3.7732</w:t>
+            </w:r>
+          </w:p>
+        </w:tc>
+        <w:tc>
+          <w:tcPr>
+            <w:tcW w:type="dxa" w:w="2610"/>
+          </w:tcPr>
+          <w:p>
+            <w:pPr>
+              <w:spacing w:after="0"/>
+            </w:pPr>
+            <w:r>
+              <w:rPr>
+                <w:sz w:val="16"/>
+              </w:rPr>
+            </w:r>
+            <w:r>
+              <w:rPr>
+                <w:rFonts w:ascii="Times New Roman" w:hAnsi="Times New Roman"/>
+                <w:sz w:val="16"/>
+              </w:rPr>
+              <w:t>0.599</w:t>
+            </w:r>
+          </w:p>
+        </w:tc>
+      </w:tr>
+      <w:tr>
+        <w:tc>
+          <w:tcPr>
+            <w:tcW w:type="dxa" w:w="2610"/>
+          </w:tcPr>
+          <w:p>
+            <w:pPr>
+              <w:spacing w:after="0"/>
+            </w:pPr>
+            <w:r>
+              <w:rPr>
+                <w:sz w:val="16"/>
+              </w:rPr>
+            </w:r>
+            <w:r>
+              <w:rPr>
+                <w:rFonts w:ascii="Times New Roman" w:hAnsi="Times New Roman"/>
+                <w:sz w:val="16"/>
+              </w:rPr>
+              <w:t>max score</w:t>
+            </w:r>
+          </w:p>
+        </w:tc>
+        <w:tc>
+          <w:tcPr>
+            <w:tcW w:type="dxa" w:w="2610"/>
+          </w:tcPr>
+          <w:p>
+            <w:pPr>
+              <w:spacing w:after="0"/>
+            </w:pPr>
+            <w:r>
+              <w:rPr>
+                <w:sz w:val="16"/>
+              </w:rPr>
+            </w:r>
+            <w:r>
+              <w:rPr>
+                <w:rFonts w:ascii="Times New Roman" w:hAnsi="Times New Roman"/>
+                <w:sz w:val="16"/>
+              </w:rPr>
+              <w:t>13.5509</w:t>
+            </w:r>
+          </w:p>
+        </w:tc>
+        <w:tc>
+          <w:tcPr>
+            <w:tcW w:type="dxa" w:w="2610"/>
+          </w:tcPr>
+          <w:p>
+            <w:pPr>
+              <w:spacing w:after="0"/>
+            </w:pPr>
+            <w:r>
+              <w:rPr>
+                <w:sz w:val="16"/>
+              </w:rPr>
+            </w:r>
+            <w:r>
+              <w:rPr>
+                <w:rFonts w:ascii="Times New Roman" w:hAnsi="Times New Roman"/>
+                <w:sz w:val="16"/>
+              </w:rPr>
+              <w:t>13.8179</w:t>
+            </w:r>
+          </w:p>
+        </w:tc>
+        <w:tc>
+          <w:tcPr>
+            <w:tcW w:type="dxa" w:w="2610"/>
+          </w:tcPr>
+          <w:p>
+            <w:pPr>
+              <w:spacing w:after="0"/>
+            </w:pPr>
+            <w:r>
+              <w:rPr>
+                <w:sz w:val="16"/>
+              </w:rPr>
+            </w:r>
+            <w:r>
+              <w:rPr>
+                <w:rFonts w:ascii="Times New Roman" w:hAnsi="Times New Roman"/>
+                <w:sz w:val="16"/>
+              </w:rPr>
+              <w:t>0.545</w:t>
+            </w:r>
+          </w:p>
+        </w:tc>
+      </w:tr>
+      <w:tr>
+        <w:tc>
+          <w:tcPr>
+            <w:tcW w:type="dxa" w:w="2610"/>
+          </w:tcPr>
+          <w:p>
+            <w:pPr>
+              <w:spacing w:after="0"/>
+            </w:pPr>
+            <w:r>
+              <w:rPr>
+                <w:sz w:val="16"/>
+              </w:rPr>
+            </w:r>
+            <w:r>
+              <w:rPr>
+                <w:rFonts w:ascii="Times New Roman" w:hAnsi="Times New Roman"/>
+                <w:sz w:val="16"/>
+              </w:rPr>
+              <w:t>mean top-k</w:t>
+            </w:r>
+          </w:p>
+        </w:tc>
+        <w:tc>
+          <w:tcPr>
+            <w:tcW w:type="dxa" w:w="2610"/>
+          </w:tcPr>
+          <w:p>
+            <w:pPr>
+              <w:spacing w:after="0"/>
+            </w:pPr>
+            <w:r>
+              <w:rPr>
+                <w:sz w:val="16"/>
+              </w:rPr>
+            </w:r>
+            <w:r>
+              <w:rPr>
+                <w:rFonts w:ascii="Times New Roman" w:hAnsi="Times New Roman"/>
+                <w:sz w:val="16"/>
+              </w:rPr>
+              <w:t>10.2447</w:t>
+            </w:r>
+          </w:p>
+        </w:tc>
+        <w:tc>
+          <w:tcPr>
+            <w:tcW w:type="dxa" w:w="2610"/>
+          </w:tcPr>
+          <w:p>
+            <w:pPr>
+              <w:spacing w:after="0"/>
+            </w:pPr>
+            <w:r>
+              <w:rPr>
+                <w:sz w:val="16"/>
+              </w:rPr>
+            </w:r>
+            <w:r>
+              <w:rPr>
+                <w:rFonts w:ascii="Times New Roman" w:hAnsi="Times New Roman"/>
+                <w:sz w:val="16"/>
+              </w:rPr>
+              <w:t>10.3221</w:t>
+            </w:r>
+          </w:p>
+        </w:tc>
+        <w:tc>
+          <w:tcPr>
+            <w:tcW w:type="dxa" w:w="2610"/>
+          </w:tcPr>
+          <w:p>
+            <w:pPr>
+              <w:spacing w:after="0"/>
+            </w:pPr>
+            <w:r>
+              <w:rPr>
+                <w:sz w:val="16"/>
+              </w:rPr>
+            </w:r>
+            <w:r>
+              <w:rPr>
+                <w:rFonts w:ascii="Times New Roman" w:hAnsi="Times New Roman"/>
+                <w:sz w:val="16"/>
+              </w:rPr>
+              <w:t>0.510</w:t>
+            </w:r>
+          </w:p>
+        </w:tc>
+      </w:tr>
+      <w:tr>
+        <w:tc>
+          <w:tcPr>
+            <w:tcW w:type="dxa" w:w="2610"/>
+          </w:tcPr>
+          <w:p>
+            <w:pPr>
+              <w:spacing w:after="0"/>
+            </w:pPr>
+            <w:r>
+              <w:rPr>
+                <w:sz w:val="16"/>
+              </w:rPr>
+            </w:r>
+            <w:r>
+              <w:rPr>
+                <w:rFonts w:ascii="Times New Roman" w:hAnsi="Times New Roman"/>
+                <w:sz w:val="16"/>
+              </w:rPr>
+              <w:t>scheme agreement</w:t>
+            </w:r>
+          </w:p>
+        </w:tc>
+        <w:tc>
+          <w:tcPr>
+            <w:tcW w:type="dxa" w:w="2610"/>
+          </w:tcPr>
+          <w:p>
+            <w:pPr>
+              <w:spacing w:after="0"/>
+            </w:pPr>
+            <w:r>
+              <w:rPr>
+                <w:sz w:val="16"/>
+              </w:rPr>
+            </w:r>
+            <w:r>
+              <w:rPr>
+                <w:rFonts w:ascii="Times New Roman" w:hAnsi="Times New Roman"/>
+                <w:sz w:val="16"/>
+              </w:rPr>
+              <w:t>0.4000</w:t>
+            </w:r>
+          </w:p>
+        </w:tc>
+        <w:tc>
+          <w:tcPr>
+            <w:tcW w:type="dxa" w:w="2610"/>
+          </w:tcPr>
+          <w:p>
+            <w:pPr>
+              <w:spacing w:after="0"/>
+            </w:pPr>
+            <w:r>
+              <w:rPr>
+                <w:sz w:val="16"/>
+              </w:rPr>
+            </w:r>
+            <w:r>
+              <w:rPr>
+                <w:rFonts w:ascii="Times New Roman" w:hAnsi="Times New Roman"/>
+                <w:sz w:val="16"/>
+              </w:rPr>
+              <w:t>0.4000</w:t>
+            </w:r>
+          </w:p>
+        </w:tc>
+        <w:tc>
+          <w:tcPr>
+            <w:tcW w:type="dxa" w:w="2610"/>
+          </w:tcPr>
+          <w:p>
+            <w:pPr>
+              <w:spacing w:after="0"/>
+            </w:pPr>
+            <w:r>
+              <w:rPr>
+                <w:sz w:val="16"/>
+              </w:rPr>
+            </w:r>
+            <w:r>
+              <w:rPr>
+                <w:rFonts w:ascii="Times New Roman" w:hAnsi="Times New Roman"/>
+                <w:sz w:val="16"/>
+              </w:rPr>
+              <w:t>0.504</w:t>
+            </w:r>
+          </w:p>
+        </w:tc>
+      </w:tr>
+    </w:tbl>
+    <w:p>
+      <w:pPr>
+        <w:spacing w:after="40"/>
+      </w:pPr>
+    </w:p>
+    <w:p>
+      <w:pPr>
+        <w:spacing w:after="0"/>
+        <w:ind w:firstLine="288"/>
+        <w:jc w:val="both"/>
+      </w:pPr>
+      <w:r>
+        <w:rPr>
+          <w:rFonts w:ascii="Times New Roman" w:hAnsi="Times New Roman"/>
+          <w:sz w:val="20"/>
+        </w:rPr>
+        <w:t>The margin deserves comment because it was the feature we expected to work. The reasoning was that a near-miss question retrieves several similarly-scoring passages — the topic is present, the specific fact is not — and so shows a smaller top1-to-top2 gap than a question with one clear answer. The prediction holds in direction: 1.28 against 2.18. It fails in magnitude. An AUC of 0.594 orders a random pair correctly 59% of the time against a chance rate of 50%, which is not a basis for abstention.</w:t>
+      </w:r>
+    </w:p>
+    <w:p>
+      <w:pPr>
+        <w:spacing w:after="0"/>
+        <w:ind w:firstLine="288"/>
+        <w:jc w:val="both"/>
+      </w:pPr>
+      <w:r>
+        <w:rPr>
+          <w:rFonts w:ascii="Times New Roman" w:hAnsi="Times New Roman"/>
+          <w:sz w:val="20"/>
+        </w:rPr>
+        <w:t>This bounds what a calibrated combination can achieve, and we report it for that reason. A logistic regression cannot extract more information than its features carry; with the best feature at 0.599 and the rest at chance, a combined retrieval-side signal should be expected to underperform, and doing so would be a property of the feature set rather than of the model.</w:t>
       </w:r>
     </w:p>
     <w:p>

</xml_diff>

<commit_message>
Quantify what the segmentation defect costs the results
86 of 694 passages draw sentences from more than one source section.
Five pair a section with its own subsection and are harmless; 81 join
unrelated material -- `Tithi Bhojan` with `Monitoring mechanism`,
`Precedents` with `Criticism` -- and 46 of the 320 answerable gold items
cite one.

A merged passage is larger than intended, so it offers more surface to
match and might inflate recall. Measured under script-aware fusion, it
does, slightly and not significantly: 0.674 [0.543, 0.804] for the 46
affected items against 0.591 [0.526, 0.650] for the other 274. The
intervals overlap heavily and, at 14% of the set, an effect that size is
worth about a point on the overall figure.

So the retrieval numbers survive. What does not survive is the claim that
section_path is reliable provenance for a generator: on those 81 it names
one section present and not the others, and §IV-A feeds exactly that to
the model.
</commit_message>
<xml_diff>
--- a/paper/IndicRAG-QA.docx
+++ b/paper/IndicRAG-QA.docx
@@ -1583,6 +1583,56 @@
           <w:sz w:val="20"/>
         </w:rPr>
         <w:t>, and 123 of the 320 answerable gold items cite one. A re-segmentation would therefore repoint more than a third of the gold set at passages that may no longer contain the answer, without a single broken reference to signal it. Content-derived identifiers would fail loudly instead, and are the right fix; changing the scheme now would invalidate the same gold set for the same reason. The corpus is frozen until verification completes, and the measurements in this paper are taken on the corpus as committed.</w:t>
+      </w:r>
+    </w:p>
+    <w:p>
+      <w:pPr>
+        <w:spacing w:after="0"/>
+        <w:ind w:firstLine="288"/>
+        <w:jc w:val="both"/>
+      </w:pPr>
+      <w:r>
+        <w:rPr>
+          <w:rFonts w:ascii="Times New Roman" w:hAnsi="Times New Roman"/>
+          <w:b/>
+          <w:sz w:val="20"/>
+        </w:rPr>
+        <w:t>How much this costs the results.</w:t>
+      </w:r>
+      <w:r>
+        <w:rPr>
+          <w:rFonts w:ascii="Times New Roman" w:hAnsi="Times New Roman"/>
+          <w:sz w:val="20"/>
+        </w:rPr>
+        <w:t xml:space="preserve"> 86 passages of 694 draw sentences from more than one source section; 5 of those pair a section with its own subsection and are harmless, leaving 81 that join unrelated material, and 46 of the 320 answerable gold items cite one. A merged passage is larger than it should be, so it presents more surface for a query to match and might be expected to inflate recall. It does, slightly and not significantly: those 46 items reach Recall@5 0.674 [0.543, 0.804] under script-aware fusion against 0.591 [0.526, 0.650] for the other 274. The intervals overlap heavily, and at 14% of the set an effect of that size moves the overall figure by about a point.</w:t>
+      </w:r>
+    </w:p>
+    <w:p>
+      <w:pPr>
+        <w:spacing w:after="0"/>
+        <w:ind w:firstLine="288"/>
+        <w:jc w:val="both"/>
+      </w:pPr>
+      <w:r>
+        <w:rPr>
+          <w:rFonts w:ascii="Times New Roman" w:hAnsi="Times New Roman"/>
+          <w:sz w:val="20"/>
+        </w:rPr>
+        <w:t xml:space="preserve">We report the defect rather than the reassurance, because the reassurance is narrow. The retrieval numbers survive it. What does not survive is the claim that a passage's </w:t>
+      </w:r>
+      <w:r>
+        <w:rPr>
+          <w:rFonts w:ascii="Consolas" w:hAnsi="Consolas"/>
+          <w:sz w:val="17"/>
+        </w:rPr>
+        <w:t>section_path</w:t>
+      </w:r>
+      <w:r>
+        <w:rPr>
+          <w:rFonts w:ascii="Times New Roman" w:hAnsi="Times New Roman"/>
+          <w:sz w:val="20"/>
+        </w:rPr>
+        <w:t xml:space="preserve"> is reliable context for a generator: for those 81 passages it names one of the sections present and not the others, which is the input §IV-A feeds the model as provenance.</w:t>
       </w:r>
     </w:p>
     <w:p>

</xml_diff>

<commit_message>
Correct the probe sweep to the frozen corpus's exact figures
2934e80 re-ran the e5 probe sweep on a rebuilt corpus that reverted only the
cross-section merge, not the later "Rs." sentence-split fix, so 12 passages
differed from the frozen ones and the sweep drifted by a query at a time. On
`corpus segment --version 1`, which reproduces every committed dense row and
the old MiniLM sweep to the last digit:

  a=0.4 0.524 vs 0.499 pure lexical (was 0.521 vs 0.497)
  margin +0.025, paired p=0.126    (was +0.024, p=0.139)

The conclusion is unchanged -- the margin is cleared, the paired test is not,
and no weighting significantly beats its better component on either set. The
report's verdict line is now the harness's own paired verdict. §VI, Figure 4,
the verdict docstring and its test carry the corrected figures; docx and pptx
rebuilt.

The gold-set figures from 604a3be needed no change: they match to the digit.
</commit_message>
<xml_diff>
--- a/paper/IndicRAG-QA.docx
+++ b/paper/IndicRAG-QA.docx
@@ -7214,7 +7214,7 @@
           <w:rFonts w:ascii="Times New Roman" w:hAnsi="Times New Roman"/>
           <w:sz w:val="20"/>
         </w:rPr>
-        <w:t>Second, the α sweep does not reverse, although an earlier version of this section said it did. That version read α = 0.4 at 0.547 against 0.416 for pure dense, a margin of 0.062 and a positive H2 verdict. The sweep was then built on the first dense index that loaded, which was the MiniLM speed baseline, while every fusion row in the table beside it is built on multilingual-e5-base; 0.416 is MiniLM's Recall@5, not the dense row's 0.522. Swept over e5, as the rest of the table is, no interior weighting beats pure dense: the best interior point is α = 0.4 at 0.516 against 0.522 at α = 0 and 0.484 at α = 1, and H2 is not supported on the gold set. The probe-set sweep plotted as Figure 4 had the same fault. Re-run over e5 it moves from a best interior margin of +0.001 to +0.024, at α = 0.4 (0.521 against 0.497 for pure lexical), which clears the sweep's 0.02 margin but not a paired test (p = 0.14, n = 180). On neither set does any weighting significantly beat the better of its two components.</w:t>
+        <w:t>Second, the α sweep does not reverse, although an earlier version of this section said it did. That version read α = 0.4 at 0.547 against 0.416 for pure dense, a margin of 0.062 and a positive H2 verdict. The sweep was then built on the first dense index that loaded, which was the MiniLM speed baseline, while every fusion row in the table beside it is built on multilingual-e5-base; 0.416 is MiniLM's Recall@5, not the dense row's 0.522. Swept over e5, as the rest of the table is, no interior weighting beats pure dense: the best interior point is α = 0.4 at 0.516 against 0.522 at α = 0 and 0.484 at α = 1, and H2 is not supported on the gold set. The probe-set sweep plotted as Figure 4 had the same fault. Re-run over e5 it moves from a best interior margin of +0.001 to +0.025, at α = 0.4 (0.524 against 0.499 for pure lexical), which clears the sweep's 0.02 margin but not a paired test (p = 0.13, n = 180). On neither set does any weighting significantly beat the better of its two components.</w:t>
       </w:r>
     </w:p>
     <w:p>
@@ -11151,7 +11151,7 @@
           <w:rFonts w:ascii="Times New Roman" w:hAnsi="Times New Roman"/>
           <w:sz w:val="20"/>
         </w:rPr>
-        <w:t>This also revises the negative result of the α sweep, plotted as Figure 4, which found no interior weighting significantly better than the better endpoint (the best, α = 0.4, is +0.024 over pure lexical at p = 0.14) and recorded the hybrid hypothesis as unsupported. That verdict was correct about weighted fusion and wrong about the hypothesis: hybrid retrieval does beat its components here, once fusion stops penalising passages for their script.</w:t>
+        <w:t>This also revises the negative result of the α sweep, plotted as Figure 4, which found no interior weighting significantly better than the better endpoint (the best, α = 0.4, is +0.025 over pure lexical at p = 0.13) and recorded the hybrid hypothesis as unsupported. That verdict was correct about weighted fusion and wrong about the hypothesis: hybrid retrieval does beat its components here, once fusion stops penalising passages for their script.</w:t>
       </w:r>
     </w:p>
     <w:p>

</xml_diff>

<commit_message>
Rewrite the abstract on verified numbers; rebuild paper, PDF and slides
The abstract still quoted probe figures (0.022 -> 0.153) and a 400-item set,
under a drafting note. It now states the test-split result, the smaller gain
over dense alone, the BM25 abstention finding, and the model verification.
Contribution 3 claimed retrieval scores carry no answerability signal; the
verified set reversed that and it now says so, and what changed.

paper.md, the IEEE .docx and a new .pdf (Word's own export, figures
embedded) are rebuilt. The slides label the three that still rest on the
unverified Module 4 run, as the deck's own rule requires. README's
findings are rewritten from the test split.
</commit_message>
<xml_diff>
--- a/paper/IndicRAG-QA.docx
+++ b/paper/IndicRAG-QA.docx
@@ -81,6 +81,93 @@
     </w:p>
     <w:p>
       <w:pPr>
+        <w:spacing w:after="120"/>
+        <w:ind w:firstLine="0" w:left="216"/>
+        <w:jc w:val="both"/>
+      </w:pPr>
+      <w:r>
+        <w:rPr>
+          <w:rFonts w:ascii="Times New Roman" w:hAnsi="Times New Roman"/>
+          <w:sz w:val="20"/>
+        </w:rPr>
+        <w:t xml:space="preserve">Retrieval-augmented generation over multilingual corpora is commonly built by fusing a lexical retriever with a dense one, on the assumption that their errors are complementary. We show that this assumption fails in a specific and correctable way when a query and its evidence are written in different scripts. A lexical retriever cannot return a passage whose script differs from the query's, because the two share almost no tokens; under rank fusion such a passage collects one vote where a same-script passage collects two, and is penalised for the lexical retriever's </w:t>
+      </w:r>
+      <w:r>
+        <w:rPr>
+          <w:rFonts w:ascii="Times New Roman" w:hAnsi="Times New Roman"/>
+          <w:i/>
+          <w:sz w:val="20"/>
+        </w:rPr>
+        <w:t>blindness</w:t>
+      </w:r>
+      <w:r>
+        <w:rPr>
+          <w:rFonts w:ascii="Times New Roman" w:hAnsi="Times New Roman"/>
+          <w:sz w:val="20"/>
+        </w:rPr>
+        <w:t xml:space="preserve"> rather than for its own irrelevance. On a bilingual Hindi–English corpus of Indian government welfare schemes and a sealed test split of 216 answerable questions, Reciprocal Rank Fusion reaches 0.274 Recall@5 on cross-lingual queries against 0.661 for its own dense component. We propose </w:t>
+      </w:r>
+      <w:r>
+        <w:rPr>
+          <w:rFonts w:ascii="Times New Roman" w:hAnsi="Times New Roman"/>
+          <w:b/>
+          <w:sz w:val="20"/>
+        </w:rPr>
+        <w:t>script-aware fusion</w:t>
+      </w:r>
+      <w:r>
+        <w:rPr>
+          <w:rFonts w:ascii="Times New Roman" w:hAnsi="Times New Roman"/>
+          <w:sz w:val="20"/>
+        </w:rPr>
+        <w:t xml:space="preserve">, which scores each candidate over the retrievers </w:t>
+      </w:r>
+      <w:r>
+        <w:rPr>
+          <w:rFonts w:ascii="Times New Roman" w:hAnsi="Times New Roman"/>
+          <w:i/>
+          <w:sz w:val="20"/>
+        </w:rPr>
+        <w:t>eligible</w:t>
+      </w:r>
+      <w:r>
+        <w:rPr>
+          <w:rFonts w:ascii="Times New Roman" w:hAnsi="Times New Roman"/>
+          <w:sz w:val="20"/>
+        </w:rPr>
+        <w:t xml:space="preserve"> to return it: it recovers 0.685 cross-lingual Recall@5 (+0.411 over plain RRF, p = 0.0001) at no monolingual cost, though its gain over the dense retriever alone is small (+0.030 overall) and significant only on code-mixed queries. For abstention, the BM25 top score separates answerable from unanswerable questions (AUC 0.791) while the fused score does not, and it catches only half of near-miss questions. We release a 393-item bilingual QA set with a query-language × evidence-language matrix and a four-class unanswerable taxonomy, verified by a language model rather than a person, and say so on every result.</w:t>
+      </w:r>
+    </w:p>
+    <w:p>
+      <w:pPr>
+        <w:spacing w:before="200" w:after="80"/>
+        <w:jc w:val="center"/>
+      </w:pPr>
+      <w:r>
+        <w:rPr>
+          <w:rFonts w:ascii="Times New Roman" w:hAnsi="Times New Roman"/>
+          <w:smallCaps/>
+          <w:sz w:val="20"/>
+        </w:rPr>
+        <w:t>I. Introduction</w:t>
+      </w:r>
+    </w:p>
+    <w:p>
+      <w:pPr>
+        <w:spacing w:before="200" w:after="80"/>
+        <w:jc w:val="left"/>
+      </w:pPr>
+      <w:r>
+        <w:rPr>
+          <w:rFonts w:ascii="Times New Roman" w:hAnsi="Times New Roman"/>
+          <w:i/>
+          <w:sz w:val="20"/>
+        </w:rPr>
+        <w:t>A. The access gap</w:t>
+      </w:r>
+    </w:p>
+    <w:p>
+      <w:pPr>
         <w:spacing w:after="0"/>
         <w:ind w:firstLine="288"/>
         <w:jc w:val="both"/>
@@ -88,97 +175,17 @@
       <w:r>
         <w:rPr>
           <w:rFonts w:ascii="Times New Roman" w:hAnsi="Times New Roman"/>
+          <w:sz w:val="20"/>
+        </w:rPr>
+        <w:t xml:space="preserve">Public-interest information in India is routinely published in one language and asked about in another. A citizen checking whether their household qualifies for a post-matric scholarship is reading a circular issued in English, or its Hindi counterpart published separately and not as a translation, and is asking the question in Hindi — or, far more commonly in practice, in Romanized Hindi–English code-mix: </w:t>
+      </w:r>
+      <w:r>
+        <w:rPr>
+          <w:rFonts w:ascii="Times New Roman" w:hAnsi="Times New Roman"/>
           <w:i/>
           <w:sz w:val="20"/>
         </w:rPr>
-        <w:t>(~210 words. Figures marked `[PROBE]`; to be re-measured on the gold set.)</w:t>
-      </w:r>
-    </w:p>
-    <w:p>
-      <w:pPr>
-        <w:spacing w:after="120"/>
-        <w:ind w:firstLine="0" w:left="216"/>
-        <w:jc w:val="both"/>
-      </w:pPr>
-      <w:r>
-        <w:rPr>
-          <w:rFonts w:ascii="Times New Roman" w:hAnsi="Times New Roman"/>
-          <w:sz w:val="20"/>
-        </w:rPr>
-        <w:t xml:space="preserve">Retrieval-augmented generation over multilingual corpora is commonly built by fusing a lexical retriever with a dense one, on the assumption that their errors are complementary. We show that this assumption fails in a specific and correctable way when a query and its evidence are written in different scripts. A lexical retriever cannot return a passage whose script differs from the query's, because the two share almost no tokens; under rank fusion such a passage collects one vote where a same-script passage collects two, and is penalised for the lexical retriever's </w:t>
-      </w:r>
-      <w:r>
-        <w:rPr>
-          <w:rFonts w:ascii="Times New Roman" w:hAnsi="Times New Roman"/>
-          <w:i/>
-          <w:sz w:val="20"/>
-        </w:rPr>
-        <w:t>blindness</w:t>
-      </w:r>
-      <w:r>
-        <w:rPr>
-          <w:rFonts w:ascii="Times New Roman" w:hAnsi="Times New Roman"/>
-          <w:sz w:val="20"/>
-        </w:rPr>
-        <w:t xml:space="preserve"> rather than for its own irrelevance. On a bilingual Hindi–English corpus of Indian government welfare schemes, Reciprocal Rank Fusion reaches 0.022 Recall@5 on cross-lingual queries against 0.125 for its own dense component. We propose </w:t>
-      </w:r>
-      <w:r>
-        <w:rPr>
-          <w:rFonts w:ascii="Times New Roman" w:hAnsi="Times New Roman"/>
-          <w:b/>
-          <w:sz w:val="20"/>
-        </w:rPr>
-        <w:t>script-aware fusion</w:t>
-      </w:r>
-      <w:r>
-        <w:rPr>
-          <w:rFonts w:ascii="Times New Roman" w:hAnsi="Times New Roman"/>
-          <w:sz w:val="20"/>
-        </w:rPr>
-        <w:t xml:space="preserve">, which scores each candidate over the retrievers </w:t>
-      </w:r>
-      <w:r>
-        <w:rPr>
-          <w:rFonts w:ascii="Times New Roman" w:hAnsi="Times New Roman"/>
-          <w:i/>
-          <w:sz w:val="20"/>
-        </w:rPr>
-        <w:t>eligible</w:t>
-      </w:r>
-      <w:r>
-        <w:rPr>
-          <w:rFonts w:ascii="Times New Roman" w:hAnsi="Times New Roman"/>
-          <w:sz w:val="20"/>
-        </w:rPr>
-        <w:t xml:space="preserve"> to return it, recovering 0.153 cross-lingual and 0.173 code-mixed Recall@5 (p = 0.0001, p = 0.0002) at a cost of 0.044 monolingual Recall@5. An oracle arm bounds what this buys end to end: generation error is 0.597 against retrieval error of 0.193, and the fusion gain is not separable from dense retrieval alone in downstream answer quality at our sample size. We release a 400-item bilingual QA set with an explicit query-language × evidence-language matrix and a four-class unanswerable taxonomy.</w:t>
-      </w:r>
-    </w:p>
-    <w:p>
-      <w:pPr>
-        <w:spacing w:before="200" w:after="80"/>
-        <w:jc w:val="center"/>
-      </w:pPr>
-      <w:r>
-        <w:rPr>
-          <w:rFonts w:ascii="Times New Roman" w:hAnsi="Times New Roman"/>
-          <w:smallCaps/>
-          <w:sz w:val="20"/>
-        </w:rPr>
-        <w:t>I. Introduction</w:t>
-      </w:r>
-    </w:p>
-    <w:p>
-      <w:pPr>
-        <w:spacing w:before="200" w:after="80"/>
-        <w:jc w:val="left"/>
-      </w:pPr>
-      <w:r>
-        <w:rPr>
-          <w:rFonts w:ascii="Times New Roman" w:hAnsi="Times New Roman"/>
-          <w:i/>
-          <w:sz w:val="20"/>
-        </w:rPr>
-        <w:t>A. The access gap</w:t>
+        <w:t>"Scholarship ke liye minimum eligibility kya hai?"</w:t>
       </w:r>
     </w:p>
     <w:p>
@@ -192,7 +199,7 @@
           <w:rFonts w:ascii="Times New Roman" w:hAnsi="Times New Roman"/>
           <w:sz w:val="20"/>
         </w:rPr>
-        <w:t xml:space="preserve">Public-interest information in India is routinely published in one language and asked about in another. A citizen checking whether their household qualifies for a post-matric scholarship is reading a circular issued in English, or its Hindi counterpart published separately and not as a translation, and is asking the question in Hindi — or, far more commonly in practice, in Romanized Hindi–English code-mix: </w:t>
+        <w:t xml:space="preserve">Keyword search fails on this query three times over. The language differs from the document's. The script differs from the document's. And the surface words differ from both, because Romanized Hindi has no standardised orthography, so the same word reaches the index as </w:t>
       </w:r>
       <w:r>
         <w:rPr>
@@ -200,7 +207,44 @@
           <w:i/>
           <w:sz w:val="20"/>
         </w:rPr>
-        <w:t>"Scholarship ke liye minimum eligibility kya hai?"</w:t>
+        <w:t>eligibility</w:t>
+      </w:r>
+      <w:r>
+        <w:rPr>
+          <w:rFonts w:ascii="Times New Roman" w:hAnsi="Times New Roman"/>
+          <w:sz w:val="20"/>
+        </w:rPr>
+        <w:t xml:space="preserve">, </w:t>
+      </w:r>
+      <w:r>
+        <w:rPr>
+          <w:rFonts w:ascii="Times New Roman" w:hAnsi="Times New Roman"/>
+          <w:i/>
+          <w:sz w:val="20"/>
+        </w:rPr>
+        <w:t>yogyata</w:t>
+      </w:r>
+      <w:r>
+        <w:rPr>
+          <w:rFonts w:ascii="Times New Roman" w:hAnsi="Times New Roman"/>
+          <w:sz w:val="20"/>
+        </w:rPr>
+        <w:t xml:space="preserve"> and </w:t>
+      </w:r>
+      <w:r>
+        <w:rPr>
+          <w:rFonts w:ascii="Times New Roman" w:hAnsi="Times New Roman"/>
+          <w:i/>
+          <w:sz w:val="20"/>
+        </w:rPr>
+        <w:t>योग्यता</w:t>
+      </w:r>
+      <w:r>
+        <w:rPr>
+          <w:rFonts w:ascii="Times New Roman" w:hAnsi="Times New Roman"/>
+          <w:sz w:val="20"/>
+        </w:rPr>
+        <w:t xml:space="preserve"> depending on who typed it. Each of these is individually well studied. Their conjunction is the ordinary case for a large population of users, and it is the setting this paper measures.</w:t>
       </w:r>
     </w:p>
     <w:p>
@@ -214,52 +258,21 @@
           <w:rFonts w:ascii="Times New Roman" w:hAnsi="Times New Roman"/>
           <w:sz w:val="20"/>
         </w:rPr>
-        <w:t xml:space="preserve">Keyword search fails on this query three times over. The language differs from the document's. The script differs from the document's. And the surface words differ from both, because Romanized Hindi has no standardised orthography, so the same word reaches the index as </w:t>
-      </w:r>
+        <w:t>The stakes are not those of open-domain question answering. Documents that govern who receives public money are consulted by people deciding whether to apply, and a confident wrong answer about an eligibility ceiling or a deadline is materially worse than no answer at all. A system in this setting must be able to say that it does not know, and must be evaluated on whether it says so in the right places rather than only on the quality of the answers it does give.</w:t>
+      </w:r>
+    </w:p>
+    <w:p>
+      <w:pPr>
+        <w:spacing w:before="200" w:after="80"/>
+        <w:jc w:val="left"/>
+      </w:pPr>
       <w:r>
         <w:rPr>
           <w:rFonts w:ascii="Times New Roman" w:hAnsi="Times New Roman"/>
           <w:i/>
           <w:sz w:val="20"/>
         </w:rPr>
-        <w:t>eligibility</w:t>
-      </w:r>
-      <w:r>
-        <w:rPr>
-          <w:rFonts w:ascii="Times New Roman" w:hAnsi="Times New Roman"/>
-          <w:sz w:val="20"/>
-        </w:rPr>
-        <w:t xml:space="preserve">, </w:t>
-      </w:r>
-      <w:r>
-        <w:rPr>
-          <w:rFonts w:ascii="Times New Roman" w:hAnsi="Times New Roman"/>
-          <w:i/>
-          <w:sz w:val="20"/>
-        </w:rPr>
-        <w:t>yogyata</w:t>
-      </w:r>
-      <w:r>
-        <w:rPr>
-          <w:rFonts w:ascii="Times New Roman" w:hAnsi="Times New Roman"/>
-          <w:sz w:val="20"/>
-        </w:rPr>
-        <w:t xml:space="preserve"> and </w:t>
-      </w:r>
-      <w:r>
-        <w:rPr>
-          <w:rFonts w:ascii="Times New Roman" w:hAnsi="Times New Roman"/>
-          <w:i/>
-          <w:sz w:val="20"/>
-        </w:rPr>
-        <w:t>योग्यता</w:t>
-      </w:r>
-      <w:r>
-        <w:rPr>
-          <w:rFonts w:ascii="Times New Roman" w:hAnsi="Times New Roman"/>
-          <w:sz w:val="20"/>
-        </w:rPr>
-        <w:t xml:space="preserve"> depending on who typed it. Each of these is individually well studied. Their conjunction is the ordinary case for a large population of users, and it is the setting this paper measures.</w:t>
+        <w:t>B. The standard remedy, and where it breaks</w:t>
       </w:r>
     </w:p>
     <w:p>
@@ -273,21 +286,7 @@
           <w:rFonts w:ascii="Times New Roman" w:hAnsi="Times New Roman"/>
           <w:sz w:val="20"/>
         </w:rPr>
-        <w:t>The stakes are not those of open-domain question answering. Documents that govern who receives public money are consulted by people deciding whether to apply, and a confident wrong answer about an eligibility ceiling or a deadline is materially worse than no answer at all. A system in this setting must be able to say that it does not know, and must be evaluated on whether it says so in the right places rather than only on the quality of the answers it does give.</w:t>
-      </w:r>
-    </w:p>
-    <w:p>
-      <w:pPr>
-        <w:spacing w:before="200" w:after="80"/>
-        <w:jc w:val="left"/>
-      </w:pPr>
-      <w:r>
-        <w:rPr>
-          <w:rFonts w:ascii="Times New Roman" w:hAnsi="Times New Roman"/>
-          <w:i/>
-          <w:sz w:val="20"/>
-        </w:rPr>
-        <w:t>B. The standard remedy, and where it breaks</w:t>
+        <w:t>The accepted response to the language and script mismatch is multilingual dense retrieval, which embeds queries and passages into a shared space and so is not bound by surface overlap. The accepted response to dense retrieval's weakness on rare terms — scheme names, amounts, section numbers — is hybrid retrieval: combine the dense retriever with a lexical one and fuse their rankings, most commonly with Reciprocal Rank Fusion, which requires no score normalisation and is strong enough to be a standard baseline.</w:t>
       </w:r>
     </w:p>
     <w:p>
@@ -301,7 +300,22 @@
           <w:rFonts w:ascii="Times New Roman" w:hAnsi="Times New Roman"/>
           <w:sz w:val="20"/>
         </w:rPr>
-        <w:t>The accepted response to the language and script mismatch is multilingual dense retrieval, which embeds queries and passages into a shared space and so is not bound by surface overlap. The accepted response to dense retrieval's weakness on rare terms — scheme names, amounts, section numbers — is hybrid retrieval: combine the dense retriever with a lexical one and fuse their rankings, most commonly with Reciprocal Rank Fusion, which requires no score normalisation and is strong enough to be a standard baseline.</w:t>
+        <w:t xml:space="preserve">We find that hybrid retrieval assembled in this standard way does not merely fail to help the cross-lingual case. It </w:t>
+      </w:r>
+      <w:r>
+        <w:rPr>
+          <w:rFonts w:ascii="Times New Roman" w:hAnsi="Times New Roman"/>
+          <w:i/>
+          <w:sz w:val="20"/>
+        </w:rPr>
+        <w:t>actively harms</w:t>
+      </w:r>
+      <w:r>
+        <w:rPr>
+          <w:rFonts w:ascii="Times New Roman" w:hAnsi="Times New Roman"/>
+          <w:sz w:val="20"/>
+        </w:rPr>
+        <w:t xml:space="preserve"> it, scoring below the dense component it contains. On the verified test split of our corpus, plain RRF reaches 0.274 Recall@5 on cross-lingual queries while its own dense retriever, used alone, reaches 0.661.</w:t>
       </w:r>
     </w:p>
     <w:p>
@@ -315,7 +329,7 @@
           <w:rFonts w:ascii="Times New Roman" w:hAnsi="Times New Roman"/>
           <w:sz w:val="20"/>
         </w:rPr>
-        <w:t xml:space="preserve">We find that hybrid retrieval assembled in this standard way does not merely fail to help the cross-lingual case. It </w:t>
+        <w:t xml:space="preserve">The cause is structural rather than a matter of tuning, which is why an α sweep over weighted fusion found nothing and reported a clean negative result. Rank fusion treats agreement between retrievers as evidence and therefore discounts a candidate returned by only one of them. Across a script boundary the lexical retriever has zero recall </w:t>
       </w:r>
       <w:r>
         <w:rPr>
@@ -323,14 +337,14 @@
           <w:i/>
           <w:sz w:val="20"/>
         </w:rPr>
-        <w:t>actively harms</w:t>
-      </w:r>
-      <w:r>
-        <w:rPr>
-          <w:rFonts w:ascii="Times New Roman" w:hAnsi="Times New Roman"/>
-          <w:sz w:val="20"/>
-        </w:rPr>
-        <w:t xml:space="preserve"> it, scoring below the dense component it contains. On the verified test split of our corpus, plain RRF reaches 0.274 Recall@5 on cross-lingual queries while its own dense retriever, used alone, reaches 0.661.</w:t>
+        <w:t>by construction</w:t>
+      </w:r>
+      <w:r>
+        <w:rPr>
+          <w:rFonts w:ascii="Times New Roman" w:hAnsi="Times New Roman"/>
+          <w:sz w:val="20"/>
+        </w:rPr>
+        <w:t xml:space="preserve"> — it cannot return a Devanagari passage for a Latin-script query at any rank, for any query, however relevant — so its silence carries no information. Fusion nonetheless charges the candidate for that silence, and does so precisely in the cases where the dense retriever is the only informative signal available.</w:t>
       </w:r>
     </w:p>
     <w:p>
@@ -344,7 +358,7 @@
           <w:rFonts w:ascii="Times New Roman" w:hAnsi="Times New Roman"/>
           <w:sz w:val="20"/>
         </w:rPr>
-        <w:t xml:space="preserve">The cause is structural rather than a matter of tuning, which is why an α sweep over weighted fusion found nothing and reported a clean negative result. Rank fusion treats agreement between retrievers as evidence and therefore discounts a candidate returned by only one of them. Across a script boundary the lexical retriever has zero recall </w:t>
+        <w:t xml:space="preserve">The correction that follows from this diagnosis is small: score each candidate over the retrievers that were </w:t>
       </w:r>
       <w:r>
         <w:rPr>
@@ -352,14 +366,28 @@
           <w:i/>
           <w:sz w:val="20"/>
         </w:rPr>
-        <w:t>by construction</w:t>
-      </w:r>
-      <w:r>
-        <w:rPr>
-          <w:rFonts w:ascii="Times New Roman" w:hAnsi="Times New Roman"/>
-          <w:sz w:val="20"/>
-        </w:rPr>
-        <w:t xml:space="preserve"> — it cannot return a Devanagari passage for a Latin-script query at any rank, for any query, however relevant — so its silence carries no information. Fusion nonetheless charges the candidate for that silence, and does so precisely in the cases where the dense retriever is the only informative signal available.</w:t>
+        <w:t>eligible</w:t>
+      </w:r>
+      <w:r>
+        <w:rPr>
+          <w:rFonts w:ascii="Times New Roman" w:hAnsi="Times New Roman"/>
+          <w:sz w:val="20"/>
+        </w:rPr>
+        <w:t xml:space="preserve"> to return it rather than over those that did. It requires no training, no tuning and one lookup per candidate, and it recovers cross-lingual Recall@5 from 0.274 to 0.685 (p = 0.0001) with no measurable cost on monolingual queries (0.964 against 0.964). What it does not do is beat the dense retriever alone by much: +0.030 overall (p = 0.052), and significantly only on code-mixed queries (+0.085, p = 0.004). The contribution is removing a harm that standard fusion introduces, not a large gain over a strong dense baseline, and we report it as such.</w:t>
+      </w:r>
+    </w:p>
+    <w:p>
+      <w:pPr>
+        <w:spacing w:before="200" w:after="80"/>
+        <w:jc w:val="left"/>
+      </w:pPr>
+      <w:r>
+        <w:rPr>
+          <w:rFonts w:ascii="Times New Roman" w:hAnsi="Times New Roman"/>
+          <w:i/>
+          <w:sz w:val="20"/>
+        </w:rPr>
+        <w:t>C. How the result was found</w:t>
       </w:r>
     </w:p>
     <w:p>
@@ -373,22 +401,7 @@
           <w:rFonts w:ascii="Times New Roman" w:hAnsi="Times New Roman"/>
           <w:sz w:val="20"/>
         </w:rPr>
-        <w:t xml:space="preserve">The correction that follows from this diagnosis is small: score each candidate over the retrievers that were </w:t>
-      </w:r>
-      <w:r>
-        <w:rPr>
-          <w:rFonts w:ascii="Times New Roman" w:hAnsi="Times New Roman"/>
-          <w:i/>
-          <w:sz w:val="20"/>
-        </w:rPr>
-        <w:t>eligible</w:t>
-      </w:r>
-      <w:r>
-        <w:rPr>
-          <w:rFonts w:ascii="Times New Roman" w:hAnsi="Times New Roman"/>
-          <w:sz w:val="20"/>
-        </w:rPr>
-        <w:t xml:space="preserve"> to return it rather than over those that did. It requires no training, no tuning and one lookup per candidate, and it recovers cross-lingual Recall@5 from 0.274 to 0.685 (p = 0.0001) with no measurable cost on monolingual queries (0.964 against 0.964). What it does not do is beat the dense retriever alone by much: +0.030 overall (p = 0.052), and significantly only on code-mixed queries (+0.085, p = 0.004). The contribution is removing a harm that standard fusion introduces, not a large gain over a strong dense baseline, and we report it as such.</w:t>
+        <w:t>We note the path deliberately, because it bears on how such systems should be evaluated. The aggregate retrieval tables showed hybrid fusion underperforming and gave no indication why; every component behaved as specified, and the hyperparameter sweep returned a negative result about a question that was not the relevant one. The mechanism became visible only on a structured reading of twenty failure cases, in which the dense retriever alone had found the gold passage in eight and plain RRF had lost all eight. A fusion method that discards every case its stronger component got right is not a method with a disappointing coefficient. Aggregate metrics did not merely fail to show this; they pointed away from it.</w:t>
       </w:r>
     </w:p>
     <w:p>
@@ -402,35 +415,64 @@
           <w:i/>
           <w:sz w:val="20"/>
         </w:rPr>
-        <w:t>C. How the result was found</w:t>
+        <w:t>D. Contributions</w:t>
       </w:r>
     </w:p>
     <w:p>
       <w:pPr>
+        <w:pStyle w:val="ListBullet"/>
         <w:spacing w:after="0"/>
-        <w:ind w:firstLine="288"/>
-        <w:jc w:val="both"/>
-      </w:pPr>
-      <w:r>
-        <w:rPr>
-          <w:rFonts w:ascii="Times New Roman" w:hAnsi="Times New Roman"/>
-          <w:sz w:val="20"/>
-        </w:rPr>
-        <w:t>We note the path deliberately, because it bears on how such systems should be evaluated. The aggregate retrieval tables showed hybrid fusion underperforming and gave no indication why; every component behaved as specified, and the hyperparameter sweep returned a negative result about a question that was not the relevant one. The mechanism became visible only on a structured reading of twenty failure cases, in which the dense retriever alone had found the gold passage in eight and plain RRF had lost all eight. A fusion method that discards every case its stronger component got right is not a method with a disappointing coefficient. Aggregate metrics did not merely fail to show this; they pointed away from it.</w:t>
+      </w:pPr>
+      <w:r>
+        <w:rPr>
+          <w:rFonts w:ascii="Times New Roman" w:hAnsi="Times New Roman"/>
+          <w:b/>
+          <w:sz w:val="20"/>
+        </w:rPr>
+        <w:t>Script-aware fusion.</w:t>
+      </w:r>
+      <w:r>
+        <w:rPr>
+          <w:rFonts w:ascii="Times New Roman" w:hAnsi="Times New Roman"/>
+          <w:sz w:val="20"/>
+        </w:rPr>
+        <w:t xml:space="preserve"> A correction to rank fusion for retrievers with asymmetric coverage of a collection, with its structural cause, a paired significance test, and its cost reported alongside its benefit. We state the scope precisely: RRF's discount on single-retriever evidence is intended behaviour rather than an oversight, and prior multilingual retrieval work already avoids the problem by restricting sparse retrieval to the query's language. Our contribution is to show that the fusion </w:t>
+      </w:r>
+      <w:r>
+        <w:rPr>
+          <w:rFonts w:ascii="Times New Roman" w:hAnsi="Times New Roman"/>
+          <w:i/>
+          <w:sz w:val="20"/>
+        </w:rPr>
+        <w:t>arithmetic</w:t>
+      </w:r>
+      <w:r>
+        <w:rPr>
+          <w:rFonts w:ascii="Times New Roman" w:hAnsi="Times New Roman"/>
+          <w:sz w:val="20"/>
+        </w:rPr>
+        <w:t xml:space="preserve"> still treats a retriever's silence as evidence, to quantify what that costs, and to correct it in a form that generalises beyond language to any asymmetric-coverage setting.</w:t>
       </w:r>
     </w:p>
     <w:p>
       <w:pPr>
-        <w:spacing w:before="200" w:after="80"/>
-        <w:jc w:val="left"/>
-      </w:pPr>
-      <w:r>
-        <w:rPr>
-          <w:rFonts w:ascii="Times New Roman" w:hAnsi="Times New Roman"/>
-          <w:i/>
-          <w:sz w:val="20"/>
-        </w:rPr>
-        <w:t>D. Contributions</w:t>
+        <w:pStyle w:val="ListBullet"/>
+        <w:spacing w:after="0"/>
+      </w:pPr>
+      <w:r>
+        <w:rPr>
+          <w:rFonts w:ascii="Times New Roman" w:hAnsi="Times New Roman"/>
+          <w:b/>
+          <w:sz w:val="20"/>
+        </w:rPr>
+        <w:t>A bilingual evidence-grounded QA set.</w:t>
+      </w:r>
+      <w:r>
+        <w:rPr>
+          <w:rFonts w:ascii="Times New Roman" w:hAnsi="Times New Roman"/>
+          <w:sz w:val="20"/>
+        </w:rPr>
+        <w:t xml:space="preserve"> 393 items over Indian government welfare schemes, with an explicit query-language × evidence-language matrix covering six cells, a four-class unanswerable taxonomy, per-item gold passage sets, and a sealed dev/test split. It was verified by a language model in two independent passes rather than by a person, which we disclose on every report built from it (§III-D, §IX).</w:t>
       </w:r>
     </w:p>
     <w:p>
@@ -444,86 +486,14 @@
           <w:b/>
           <w:sz w:val="20"/>
         </w:rPr>
-        <w:t>Script-aware fusion.</w:t>
-      </w:r>
-      <w:r>
-        <w:rPr>
-          <w:rFonts w:ascii="Times New Roman" w:hAnsi="Times New Roman"/>
-          <w:sz w:val="20"/>
-        </w:rPr>
-        <w:t xml:space="preserve"> A correction to rank fusion for retrievers with asymmetric coverage of a collection, with its structural cause, a paired significance test, and its cost reported alongside its benefit. We state the scope precisely: RRF's discount on single-retriever evidence is intended behaviour rather than an oversight, and prior multilingual retrieval work already avoids the problem by restricting sparse retrieval to the query's language. Our contribution is to show that the fusion </w:t>
-      </w:r>
-      <w:r>
-        <w:rPr>
-          <w:rFonts w:ascii="Times New Roman" w:hAnsi="Times New Roman"/>
-          <w:i/>
-          <w:sz w:val="20"/>
-        </w:rPr>
-        <w:t>arithmetic</w:t>
-      </w:r>
-      <w:r>
-        <w:rPr>
-          <w:rFonts w:ascii="Times New Roman" w:hAnsi="Times New Roman"/>
-          <w:sz w:val="20"/>
-        </w:rPr>
-        <w:t xml:space="preserve"> still treats a retriever's silence as evidence, to quantify what that costs, and to correct it in a form that generalises beyond language to any asymmetric-coverage setting.</w:t>
-      </w:r>
-    </w:p>
-    <w:p>
-      <w:pPr>
-        <w:pStyle w:val="ListBullet"/>
-        <w:spacing w:after="0"/>
-      </w:pPr>
-      <w:r>
-        <w:rPr>
-          <w:rFonts w:ascii="Times New Roman" w:hAnsi="Times New Roman"/>
-          <w:b/>
-          <w:sz w:val="20"/>
-        </w:rPr>
-        <w:t>A bilingual evidence-grounded QA set.</w:t>
-      </w:r>
-      <w:r>
-        <w:rPr>
-          <w:rFonts w:ascii="Times New Roman" w:hAnsi="Times New Roman"/>
-          <w:sz w:val="20"/>
-        </w:rPr>
-        <w:t xml:space="preserve"> 393 items over Indian government welfare schemes, with an explicit query-language × evidence-language matrix covering six cells, a four-class unanswerable taxonomy, per-item gold passage sets, and a sealed dev/test split. It was verified by a language model in two independent passes rather than by a person, which we disclose on every report built from it (§III-D, §IX).</w:t>
-      </w:r>
-    </w:p>
-    <w:p>
-      <w:pPr>
-        <w:pStyle w:val="ListBullet"/>
-        <w:spacing w:after="0"/>
-      </w:pPr>
-      <w:r>
-        <w:rPr>
-          <w:rFonts w:ascii="Times New Roman" w:hAnsi="Times New Roman"/>
-          <w:b/>
-          <w:sz w:val="20"/>
-        </w:rPr>
-        <w:t>A four-signal comparison of answerability, and a negative result on the standard one.</w:t>
-      </w:r>
-      <w:r>
-        <w:rPr>
-          <w:rFonts w:ascii="Times New Roman" w:hAnsi="Times New Roman"/>
-          <w:sz w:val="20"/>
-        </w:rPr>
-        <w:t xml:space="preserve"> Retrieval-score thresholds carry no information on a corpus whose unanswerable questions concern present topics: answerable and unanswerable questions have indistinguishable top scores — 13.55 against 13.82 for BM25, with the </w:t>
-      </w:r>
-      <w:r>
-        <w:rPr>
-          <w:rFonts w:ascii="Times New Roman" w:hAnsi="Times New Roman"/>
-          <w:i/>
-          <w:sz w:val="20"/>
-        </w:rPr>
-        <w:t>unanswerable</w:t>
-      </w:r>
-      <w:r>
-        <w:rPr>
-          <w:rFonts w:ascii="Times New Roman" w:hAnsi="Times New Roman"/>
-          <w:sz w:val="20"/>
-        </w:rPr>
-        <w:t xml:space="preserve"> marginally higher — and precision across the full sweep stays at the base rate. A retrieval threshold is a corpus-absence detector and answerability is not corpus absence. Both retrieval-side signals degenerate to near-total abstention, the calibrated combination literally refusing every question in the reported set; the generator's own abstention is the only signal producing a usable system, and an entailment check on top of it adds nothing because the generator has already declined nearly everything it should.</w:t>
+        <w:t>Which retrieval score carries an abstention signal.</w:t>
+      </w:r>
+      <w:r>
+        <w:rPr>
+          <w:rFonts w:ascii="Times New Roman" w:hAnsi="Times New Roman"/>
+          <w:sz w:val="20"/>
+        </w:rPr>
+        <w:t xml:space="preserve"> On verified questions the BM25 top score separates answerable from unanswerable (medians 25.5 against 13.8, AUC 0.791; test F1 0.525), while the rank-fused score does not (0.0328 against 0.0325), because rank fusion discards magnitudes. A threshold on the lexical score rejects every out-of-scope question and about half of near-misses — questions about a covered scheme asking for a fact it does not state — which only a reader of the passage can catch. Before verification the same measurement showed no signal at all; malformed questions had hidden it, and we report both.</w:t>
       </w:r>
     </w:p>
     <w:p>
@@ -2730,7 +2700,7 @@
           <w:rFonts w:ascii="Times New Roman" w:hAnsi="Times New Roman"/>
           <w:sz w:val="20"/>
         </w:rPr>
-        <w:t>, and every report built on the set carries that disclosure in its banner. The figures in §VI are therefore model-verified, which is weaker than the human verification the protocol was designed around. The blind second pass (§VIII) was likewise run by a model instance, and its κ = 1.000 over 59 items measures one model's consistency, not agreement between annotators.</w:t>
+        <w:t>, and every report built on the set carries that disclosure in its banner. The figures in §VI are therefore model-verified, which is weaker than the human verification the protocol was designed around. The blind second pass (§IX) was likewise run by a model instance, and its κ = 1.000 over 59 items measures one model's consistency, not agreement between annotators.</w:t>
       </w:r>
     </w:p>
     <w:p>
@@ -4595,6 +4565,60 @@
     </w:p>
     <w:p>
       <w:pPr>
+        <w:keepNext/>
+        <w:spacing w:before="120" w:after="40"/>
+        <w:jc w:val="center"/>
+      </w:pPr>
+      <w:r>
+        <w:drawing>
+          <wp:inline xmlns:a="http://schemas.openxmlformats.org/drawingml/2006/main" xmlns:pic="http://schemas.openxmlformats.org/drawingml/2006/picture">
+            <wp:extent cx="3200400" cy="1494717"/>
+            <wp:docPr id="1" name="Picture 1"/>
+            <wp:cNvGraphicFramePr>
+              <a:graphicFrameLocks noChangeAspect="1"/>
+            </wp:cNvGraphicFramePr>
+            <a:graphic>
+              <a:graphicData uri="http://schemas.openxmlformats.org/drawingml/2006/picture">
+                <pic:pic>
+                  <pic:nvPicPr>
+                    <pic:cNvPr id="0" name="fig1-pipeline.png"/>
+                    <pic:cNvPicPr/>
+                  </pic:nvPicPr>
+                  <pic:blipFill>
+                    <a:blip r:embed="rId9"/>
+                    <a:stretch>
+                      <a:fillRect/>
+                    </a:stretch>
+                  </pic:blipFill>
+                  <pic:spPr>
+                    <a:xfrm>
+                      <a:off x="0" y="0"/>
+                      <a:ext cx="3200400" cy="1494717"/>
+                    </a:xfrm>
+                    <a:prstGeom prst="rect"/>
+                  </pic:spPr>
+                </pic:pic>
+              </a:graphicData>
+            </a:graphic>
+          </wp:inline>
+        </w:drawing>
+      </w:r>
+    </w:p>
+    <w:p>
+      <w:pPr>
+        <w:spacing w:after="160"/>
+        <w:jc w:val="both"/>
+      </w:pPr>
+      <w:r>
+        <w:rPr>
+          <w:rFonts w:ascii="Times New Roman" w:hAnsi="Times New Roman"/>
+          <w:sz w:val="16"/>
+        </w:rPr>
+        <w:t>Fig. 1. System pipeline. Offline, once: Devanagari validation, segmentation, and lexical and dense indexing. Per query: language and script identification, script-aware fusion, generation constrained to the evidence, and an answerability decision. One path serves all three query types.</w:t>
+      </w:r>
+    </w:p>
+    <w:p>
+      <w:pPr>
         <w:spacing w:after="0"/>
         <w:ind w:firstLine="288"/>
         <w:jc w:val="both"/>
@@ -8135,7 +8159,61 @@
           <w:rFonts w:ascii="Times New Roman" w:hAnsi="Times New Roman"/>
           <w:sz w:val="20"/>
         </w:rPr>
-        <w:t xml:space="preserve"> BM25 reaches 0.970 on monolingual questions and 0.153 on cross-lingual ones. MuRIL, pretrained on Indic text but not trained for retrieval, reaches 0.048.</w:t>
+        <w:t xml:space="preserve"> BM25 reaches 0.970 on monolingual questions and 0.153 on cross-lingual ones. MuRIL, pretrained on Indic text but not trained for retrieval, reaches 0.048. Figure 2 plots the breakdown.</w:t>
+      </w:r>
+    </w:p>
+    <w:p>
+      <w:pPr>
+        <w:keepNext/>
+        <w:spacing w:before="120" w:after="40"/>
+        <w:jc w:val="center"/>
+      </w:pPr>
+      <w:r>
+        <w:drawing>
+          <wp:inline xmlns:a="http://schemas.openxmlformats.org/drawingml/2006/main" xmlns:pic="http://schemas.openxmlformats.org/drawingml/2006/picture">
+            <wp:extent cx="3200400" cy="1436014"/>
+            <wp:docPr id="2" name="Picture 2"/>
+            <wp:cNvGraphicFramePr>
+              <a:graphicFrameLocks noChangeAspect="1"/>
+            </wp:cNvGraphicFramePr>
+            <a:graphic>
+              <a:graphicData uri="http://schemas.openxmlformats.org/drawingml/2006/picture">
+                <pic:pic>
+                  <pic:nvPicPr>
+                    <pic:cNvPr id="0" name="fig2-by-language-group.png"/>
+                    <pic:cNvPicPr/>
+                  </pic:nvPicPr>
+                  <pic:blipFill>
+                    <a:blip r:embed="rId10"/>
+                    <a:stretch>
+                      <a:fillRect/>
+                    </a:stretch>
+                  </pic:blipFill>
+                  <pic:spPr>
+                    <a:xfrm>
+                      <a:off x="0" y="0"/>
+                      <a:ext cx="3200400" cy="1436014"/>
+                    </a:xfrm>
+                    <a:prstGeom prst="rect"/>
+                  </pic:spPr>
+                </pic:pic>
+              </a:graphicData>
+            </a:graphic>
+          </wp:inline>
+        </w:drawing>
+      </w:r>
+    </w:p>
+    <w:p>
+      <w:pPr>
+        <w:spacing w:after="160"/>
+        <w:jc w:val="both"/>
+      </w:pPr>
+      <w:r>
+        <w:rPr>
+          <w:rFonts w:ascii="Times New Roman" w:hAnsi="Times New Roman"/>
+          <w:sz w:val="16"/>
+        </w:rPr>
+        <w:t>Fig. 2. Recall@5 by language group on the test split (216 answerable questions). Lexical retrieval collapses across the script boundary; MuRIL, pretrained on Indic text but not for retrieval, barely crosses it.</w:t>
       </w:r>
     </w:p>
     <w:p>
@@ -8179,7 +8257,61 @@
           <w:rFonts w:ascii="Times New Roman" w:hAnsi="Times New Roman"/>
           <w:sz w:val="20"/>
         </w:rPr>
-        <w:t xml:space="preserve"> This is where the verified set changes the story. Before verification, script-aware fusion beat e5-base alone by +0.133 on cross-lingual questions and +0.081 overall. On the test split it is +0.024 cross-lingually (p = 0.62) and +0.030 overall (p = 0.052); the only significant gain is on code-mixed questions, +0.085 (p = 0.0037), where Romanized questions carrying English scheme names give the lexical retriever something real to contribute. Pooling dev and test for power, the overall gain is +0.027 (p = 0.021). The margin shrank when verification rewrote 112 garbled questions, most of them in the cross-lingual and code-mixed cells; our reading is that fusion was partly compensating for questions a dense retriever could not match because they did not say what they asked, though the rewrite and the relabelling changed too much at once to isolate that cause. On well-formed questions, a strong multilingual dense retriever alone does nearly as well as the corrected hybrid.</w:t>
+        <w:t xml:space="preserve"> This is where the verified set changes the story. Before verification, script-aware fusion beat e5-base alone by +0.133 on cross-lingual questions and +0.081 overall. On the test split it is +0.024 cross-lingually (p = 0.62) and +0.030 overall (p = 0.052); the only significant gain is on code-mixed questions, +0.085 (p = 0.0037), where Romanized questions carrying English scheme names give the lexical retriever something real to contribute. Pooling dev and test for power, the overall gain is +0.027 (p = 0.021). The margin shrank when verification rewrote 112 garbled questions, most of them in the cross-lingual and code-mixed cells; our reading is that fusion was partly compensating for questions a dense retriever could not match because they did not say what they asked, though the rewrite and the relabelling changed too much at once to isolate that cause. On well-formed questions, a strong multilingual dense retriever alone does nearly as well as the corrected hybrid. Figure 3 shows both comparisons on every slice.</w:t>
+      </w:r>
+    </w:p>
+    <w:p>
+      <w:pPr>
+        <w:keepNext/>
+        <w:spacing w:before="120" w:after="40"/>
+        <w:jc w:val="center"/>
+      </w:pPr>
+      <w:r>
+        <w:drawing>
+          <wp:inline xmlns:a="http://schemas.openxmlformats.org/drawingml/2006/main" xmlns:pic="http://schemas.openxmlformats.org/drawingml/2006/picture">
+            <wp:extent cx="3200400" cy="1495330"/>
+            <wp:docPr id="3" name="Picture 3"/>
+            <wp:cNvGraphicFramePr>
+              <a:graphicFrameLocks noChangeAspect="1"/>
+            </wp:cNvGraphicFramePr>
+            <a:graphic>
+              <a:graphicData uri="http://schemas.openxmlformats.org/drawingml/2006/picture">
+                <pic:pic>
+                  <pic:nvPicPr>
+                    <pic:cNvPr id="0" name="fig3-fusion-goldset.png"/>
+                    <pic:cNvPicPr/>
+                  </pic:nvPicPr>
+                  <pic:blipFill>
+                    <a:blip r:embed="rId11"/>
+                    <a:stretch>
+                      <a:fillRect/>
+                    </a:stretch>
+                  </pic:blipFill>
+                  <pic:spPr>
+                    <a:xfrm>
+                      <a:off x="0" y="0"/>
+                      <a:ext cx="3200400" cy="1495330"/>
+                    </a:xfrm>
+                    <a:prstGeom prst="rect"/>
+                  </pic:spPr>
+                </pic:pic>
+              </a:graphicData>
+            </a:graphic>
+          </wp:inline>
+        </w:drawing>
+      </w:r>
+    </w:p>
+    <w:p>
+      <w:pPr>
+        <w:spacing w:after="160"/>
+        <w:jc w:val="both"/>
+      </w:pPr>
+      <w:r>
+        <w:rPr>
+          <w:rFonts w:ascii="Times New Roman" w:hAnsi="Times New Roman"/>
+          <w:sz w:val="16"/>
+        </w:rPr>
+        <w:t>Fig. 3. Script-aware fusion on the test split, against plain RRF (the repair) and against dense retrieval alone (whether fusing is worth it), with paired randomization-test p-values.</w:t>
       </w:r>
     </w:p>
     <w:p>
@@ -8215,7 +8347,61 @@
           <w:rFonts w:ascii="Times New Roman" w:hAnsi="Times New Roman"/>
           <w:sz w:val="20"/>
         </w:rPr>
-        <w:t xml:space="preserve"> Sweeping α over e5-base and BM25, no interior weighting beats pure dense on the test split (best α = 0.1 at 0.720, equal to α = 0), and none does on the pooled set (0.728 at α = 0.1 against 0.736). H2, in its weighted-fusion form, is not supported. An earlier version of this section reported the opposite; that sweep used the wrong dense encoder for its endpoint (§VIII), and was corrected before verification.</w:t>
+        <w:t xml:space="preserve"> Sweeping α over e5-base and BM25, no interior weighting beats pure dense on the test split (best α = 0.1 at 0.720, equal to α = 0; Figure 4), and none does on the pooled set (0.728 at α = 0.1 against 0.736). H2, in its weighted-fusion form, is not supported. An earlier version of this section reported the opposite; that sweep used the wrong dense encoder for its endpoint, and was corrected before verification.</w:t>
+      </w:r>
+    </w:p>
+    <w:p>
+      <w:pPr>
+        <w:keepNext/>
+        <w:spacing w:before="120" w:after="40"/>
+        <w:jc w:val="center"/>
+      </w:pPr>
+      <w:r>
+        <w:drawing>
+          <wp:inline xmlns:a="http://schemas.openxmlformats.org/drawingml/2006/main" xmlns:pic="http://schemas.openxmlformats.org/drawingml/2006/picture">
+            <wp:extent cx="3200400" cy="1999367"/>
+            <wp:docPr id="4" name="Picture 4"/>
+            <wp:cNvGraphicFramePr>
+              <a:graphicFrameLocks noChangeAspect="1"/>
+            </wp:cNvGraphicFramePr>
+            <a:graphic>
+              <a:graphicData uri="http://schemas.openxmlformats.org/drawingml/2006/picture">
+                <pic:pic>
+                  <pic:nvPicPr>
+                    <pic:cNvPr id="0" name="fig4-alpha-sweep.png"/>
+                    <pic:cNvPicPr/>
+                  </pic:nvPicPr>
+                  <pic:blipFill>
+                    <a:blip r:embed="rId12"/>
+                    <a:stretch>
+                      <a:fillRect/>
+                    </a:stretch>
+                  </pic:blipFill>
+                  <pic:spPr>
+                    <a:xfrm>
+                      <a:off x="0" y="0"/>
+                      <a:ext cx="3200400" cy="1999367"/>
+                    </a:xfrm>
+                    <a:prstGeom prst="rect"/>
+                  </pic:spPr>
+                </pic:pic>
+              </a:graphicData>
+            </a:graphic>
+          </wp:inline>
+        </w:drawing>
+      </w:r>
+    </w:p>
+    <w:p>
+      <w:pPr>
+        <w:spacing w:after="160"/>
+        <w:jc w:val="both"/>
+      </w:pPr>
+      <w:r>
+        <w:rPr>
+          <w:rFonts w:ascii="Times New Roman" w:hAnsi="Times New Roman"/>
+          <w:sz w:val="16"/>
+        </w:rPr>
+        <w:t>Fig. 4. Weighted fusion of BM25 and e5-base across α on the test split. No weighting beats pure dense; script-aware RRF, drawn for reference, does -- by changing how ranks combine rather than how much each retriever counts.</w:t>
       </w:r>
     </w:p>
     <w:p>
@@ -10533,7 +10719,7 @@
           <w:rFonts w:ascii="Times New Roman" w:hAnsi="Times New Roman"/>
           <w:sz w:val="20"/>
         </w:rPr>
-        <w:t>Figure 2 plots the same numbers. Lexical retrieval does not cross the language boundary at all: BM25 scores 0.740 monolingual and 0.006 cross-lingual — a factor of more than a hundred. This is not a weakness to be tuned away but the expected consequence of matching surface tokens between a Devanagari query and a Latin-script passage that share essentially none. It is the empirical form of the structural claim in §VIII, and it is what makes the fusion behaviour in §VI-E a predictable consequence rather than a surprise.</w:t>
+        <w:t>Lexical retrieval does not cross the language boundary at all: BM25 scores 0.740 monolingual and 0.006 cross-lingual — a factor of more than a hundred. The verified test split (Table II, Figure 2) has the same shape at less extreme magnitudes, 0.970 against 0.153, because real questions carry scheme names and numbers that occasionally survive the script change. This is not a weakness to be tuned away but the expected consequence of matching surface tokens between a Devanagari query and a Latin-script passage that share essentially none. It is the empirical form of the structural claim in §VIII, and it is what makes the fusion behaviour in §VI-E a predictable consequence rather than a surprise.</w:t>
       </w:r>
     </w:p>
     <w:p>
@@ -11287,7 +11473,61 @@
           <w:rFonts w:ascii="Times New Roman" w:hAnsi="Times New Roman"/>
           <w:sz w:val="20"/>
         </w:rPr>
-        <w:t>Figure 3 plots the table, with the monolingual regression on the same axes as the gains rather than in a separate panel. Against dense alone — the comparison that decides whether hybrid retrieval earns its place at all — script-aware fusion gains +0.028 cross-lingual (p = 0.037), +0.041 code-mixed (p = 0.074) and +0.050 overall (p = 0.0086).</w:t>
+        <w:t>Figure 5 plots the table, with the monolingual regression on the same axes as the gains rather than in a separate panel.</w:t>
+      </w:r>
+    </w:p>
+    <w:p>
+      <w:pPr>
+        <w:keepNext/>
+        <w:spacing w:before="120" w:after="40"/>
+        <w:jc w:val="center"/>
+      </w:pPr>
+      <w:r>
+        <w:drawing>
+          <wp:inline xmlns:a="http://schemas.openxmlformats.org/drawingml/2006/main" xmlns:pic="http://schemas.openxmlformats.org/drawingml/2006/picture">
+            <wp:extent cx="3200400" cy="1436014"/>
+            <wp:docPr id="5" name="Picture 5"/>
+            <wp:cNvGraphicFramePr>
+              <a:graphicFrameLocks noChangeAspect="1"/>
+            </wp:cNvGraphicFramePr>
+            <a:graphic>
+              <a:graphicData uri="http://schemas.openxmlformats.org/drawingml/2006/picture">
+                <pic:pic>
+                  <pic:nvPicPr>
+                    <pic:cNvPr id="0" name="fig5-fusion-probes.png"/>
+                    <pic:cNvPicPr/>
+                  </pic:nvPicPr>
+                  <pic:blipFill>
+                    <a:blip r:embed="rId13"/>
+                    <a:stretch>
+                      <a:fillRect/>
+                    </a:stretch>
+                  </pic:blipFill>
+                  <pic:spPr>
+                    <a:xfrm>
+                      <a:off x="0" y="0"/>
+                      <a:ext cx="3200400" cy="1436014"/>
+                    </a:xfrm>
+                    <a:prstGeom prst="rect"/>
+                  </pic:spPr>
+                </pic:pic>
+              </a:graphicData>
+            </a:graphic>
+          </wp:inline>
+        </w:drawing>
+      </w:r>
+    </w:p>
+    <w:p>
+      <w:pPr>
+        <w:spacing w:after="160"/>
+        <w:jc w:val="both"/>
+      </w:pPr>
+      <w:r>
+        <w:rPr>
+          <w:rFonts w:ascii="Times New Roman" w:hAnsi="Times New Roman"/>
+          <w:sz w:val="16"/>
+        </w:rPr>
+        <w:t>Fig. 5. [PROBE] Script-aware against plain RRF on the 180 synthetic probes, where the mechanism was found. The monolingual cost shown here does not appear on the verified set (Figure 3).</w:t>
       </w:r>
     </w:p>
     <w:p>
@@ -11301,7 +11541,7 @@
           <w:rFonts w:ascii="Times New Roman" w:hAnsi="Times New Roman"/>
           <w:sz w:val="20"/>
         </w:rPr>
-        <w:t>Three things should be read from this table rather than one.</w:t>
+        <w:t>Against dense alone — the comparison that decides whether hybrid retrieval earns its place at all — script-aware fusion gains +0.028 cross-lingual (p = 0.037), +0.041 code-mixed (p = 0.074) and +0.050 overall (p = 0.0086).</w:t>
       </w:r>
     </w:p>
     <w:p>
@@ -11315,7 +11555,7 @@
           <w:rFonts w:ascii="Times New Roman" w:hAnsi="Times New Roman"/>
           <w:sz w:val="20"/>
         </w:rPr>
-        <w:t>First, the gain on the target slices is large and significant. Second, the monolingual regression is real, significant, and the price of the method: removing the lexical double-vote costs precision where both retrievers could see the same passage and agreement between them genuinely was evidence. Third, the overall row is indistinguishable from noise, and a paper reporting only that row would conceal both the gain and the cost.</w:t>
+        <w:t>Three things should be read from this table rather than one.</w:t>
       </w:r>
     </w:p>
     <w:p>
@@ -11329,21 +11569,7 @@
           <w:rFonts w:ascii="Times New Roman" w:hAnsi="Times New Roman"/>
           <w:sz w:val="20"/>
         </w:rPr>
-        <w:t>This also revises the negative result of the α sweep, plotted as Figure 4, which found no interior weighting significantly better than the better endpoint (the best, α = 0.4, is +0.025 over pure lexical at p = 0.13) and recorded the hybrid hypothesis as unsupported. That verdict was correct about weighted fusion and wrong about the hypothesis: hybrid retrieval does beat its components here, once fusion stops penalising passages for their script.</w:t>
-      </w:r>
-    </w:p>
-    <w:p>
-      <w:pPr>
-        <w:spacing w:before="200" w:after="80"/>
-        <w:jc w:val="left"/>
-      </w:pPr>
-      <w:r>
-        <w:rPr>
-          <w:rFonts w:ascii="Times New Roman" w:hAnsi="Times New Roman"/>
-          <w:i/>
-          <w:sz w:val="20"/>
-        </w:rPr>
-        <w:t>F. A caveat the fusion result does not remove</w:t>
+        <w:t>First, the gain on the target slices is large and significant. Second, the monolingual regression is real, significant, and the price of the method: removing the lexical double-vote costs precision where both retrievers could see the same passage and agreement between them genuinely was evidence. Third, the overall row is indistinguishable from noise, and a paper reporting only that row would conceal both the gain and the cost.</w:t>
       </w:r>
     </w:p>
     <w:p>
@@ -11357,37 +11583,21 @@
           <w:rFonts w:ascii="Times New Roman" w:hAnsi="Times New Roman"/>
           <w:sz w:val="20"/>
         </w:rPr>
-        <w:t xml:space="preserve">LaBSE, used alone, reaches </w:t>
-      </w:r>
-      <w:r>
-        <w:rPr>
-          <w:rFonts w:ascii="Times New Roman" w:hAnsi="Times New Roman"/>
-          <w:b/>
-          <w:sz w:val="20"/>
-        </w:rPr>
-        <w:t>0.332</w:t>
-      </w:r>
-      <w:r>
-        <w:rPr>
-          <w:rFonts w:ascii="Times New Roman" w:hAnsi="Times New Roman"/>
-          <w:sz w:val="20"/>
-        </w:rPr>
-        <w:t xml:space="preserve"> on the code-mixed slice against 0.173 for script-aware fusion over BM25 and e5-base. Paired over the 30 code-mixed queries that is +0.159 at </w:t>
-      </w:r>
-      <w:r>
-        <w:rPr>
-          <w:rFonts w:ascii="Times New Roman" w:hAnsi="Times New Roman"/>
-          <w:b/>
-          <w:sz w:val="20"/>
-        </w:rPr>
-        <w:t>p = 0.0094</w:t>
-      </w:r>
-      <w:r>
-        <w:rPr>
-          <w:rFonts w:ascii="Times New Roman" w:hAnsi="Times New Roman"/>
-          <w:sz w:val="20"/>
-        </w:rPr>
-        <w:t>, so on code-mixed queries choosing a different encoder genuinely outperforms correcting the fusion over a weaker one.</w:t>
+        <w:t>This also revises the negative result of the α sweep, which on the probes found no interior weighting significantly better than the better endpoint (the best, α = 0.4, was +0.025 over pure lexical at p = 0.13) and recorded the hybrid hypothesis as unsupported. That verdict was correct about weighted fusion, and on the verified set no weighting beats pure dense at all (Figure 4). Whether hybrid retrieval beats its components once fusion stops penalising passages for their script is answered in §VI-A: it does on code-mixed queries, and is within noise elsewhere.</w:t>
+      </w:r>
+    </w:p>
+    <w:p>
+      <w:pPr>
+        <w:spacing w:before="200" w:after="80"/>
+        <w:jc w:val="left"/>
+      </w:pPr>
+      <w:r>
+        <w:rPr>
+          <w:rFonts w:ascii="Times New Roman" w:hAnsi="Times New Roman"/>
+          <w:i/>
+          <w:sz w:val="20"/>
+        </w:rPr>
+        <w:t>F. A caveat the fusion result does not remove</w:t>
       </w:r>
     </w:p>
     <w:p>
@@ -11401,7 +11611,37 @@
           <w:rFonts w:ascii="Times New Roman" w:hAnsi="Times New Roman"/>
           <w:sz w:val="20"/>
         </w:rPr>
-        <w:t>The reverse holds elsewhere, and equally significantly. On the monolingual slice LaBSE loses to the fused system by 0.233 (p = 0.0001), and on the cross-lingual slice it is behind by 0.056, which is within noise (p = 0.34). LaBSE is not a better retriever; it is a differently shaped one, and the shape happens to suit Romanized Hindi.</w:t>
+        <w:t xml:space="preserve">LaBSE, used alone, reaches </w:t>
+      </w:r>
+      <w:r>
+        <w:rPr>
+          <w:rFonts w:ascii="Times New Roman" w:hAnsi="Times New Roman"/>
+          <w:b/>
+          <w:sz w:val="20"/>
+        </w:rPr>
+        <w:t>0.332</w:t>
+      </w:r>
+      <w:r>
+        <w:rPr>
+          <w:rFonts w:ascii="Times New Roman" w:hAnsi="Times New Roman"/>
+          <w:sz w:val="20"/>
+        </w:rPr>
+        <w:t xml:space="preserve"> on the code-mixed slice against 0.173 for script-aware fusion over BM25 and e5-base. Paired over the 30 code-mixed queries that is +0.159 at </w:t>
+      </w:r>
+      <w:r>
+        <w:rPr>
+          <w:rFonts w:ascii="Times New Roman" w:hAnsi="Times New Roman"/>
+          <w:b/>
+          <w:sz w:val="20"/>
+        </w:rPr>
+        <w:t>p = 0.0094</w:t>
+      </w:r>
+      <w:r>
+        <w:rPr>
+          <w:rFonts w:ascii="Times New Roman" w:hAnsi="Times New Roman"/>
+          <w:sz w:val="20"/>
+        </w:rPr>
+        <w:t>, so on code-mixed queries choosing a different encoder genuinely outperforms correcting the fusion over a weaker one.</w:t>
       </w:r>
     </w:p>
     <w:p>
@@ -11415,7 +11655,7 @@
           <w:rFonts w:ascii="Times New Roman" w:hAnsi="Times New Roman"/>
           <w:sz w:val="20"/>
         </w:rPr>
-        <w:t>We state this plainly because it qualifies the practical reading of §VI-E. The fusion correction is orthogonal to the choice of encoder: it is a statement about how rankings are combined, and nothing prevents applying it over LaBSE, which we have not tested and would expect to be stronger than either.</w:t>
+        <w:t>The reverse holds elsewhere, and equally significantly. On the monolingual slice LaBSE loses to the fused system by 0.233 (p = 0.0001), and on the cross-lingual slice it is behind by 0.056, which is within noise (p = 0.34). LaBSE is not a better retriever; it is a differently shaped one, and the shape happens to suit Romanized Hindi.</w:t>
       </w:r>
     </w:p>
     <w:p>
@@ -11429,7 +11669,21 @@
           <w:rFonts w:ascii="Times New Roman" w:hAnsi="Times New Roman"/>
           <w:sz w:val="20"/>
         </w:rPr>
-        <w:t xml:space="preserve">The result contradicts our own prior expectation, recorded before the experiment, that LaBSE would lead the cross-lingual slice by virtue of its translation-ranking objective. Instead it is the only model that handles Romanized Hindi well. If this survives the gold set, the practical guidance is to select the encoder by query </w:t>
+        <w:t>We state this plainly because it qualifies the practical reading of §VI-E. The fusion correction is orthogonal to the choice of encoder: it is a statement about how rankings are combined, and nothing prevents applying it over LaBSE. §VI-A.1 does so on the verified set: fusion over LaBSE gains +0.085 over LaBSE alone, and remains well below fusion over e5-base.</w:t>
+      </w:r>
+    </w:p>
+    <w:p>
+      <w:pPr>
+        <w:spacing w:after="0"/>
+        <w:ind w:firstLine="288"/>
+        <w:jc w:val="both"/>
+      </w:pPr>
+      <w:r>
+        <w:rPr>
+          <w:rFonts w:ascii="Times New Roman" w:hAnsi="Times New Roman"/>
+          <w:sz w:val="20"/>
+        </w:rPr>
+        <w:t xml:space="preserve">The result contradicts our own prior expectation, recorded before the experiment, that LaBSE would lead the cross-lingual slice by virtue of its translation-ranking objective. Instead it is the only model that handles Romanized Hindi well. On the probes that suggested selecting the encoder by query </w:t>
       </w:r>
       <w:r>
         <w:rPr>
@@ -11444,7 +11698,7 @@
           <w:rFonts w:ascii="Times New Roman" w:hAnsi="Times New Roman"/>
           <w:sz w:val="20"/>
         </w:rPr>
-        <w:t xml:space="preserve"> rather than by language coverage, and it is the most immediately useful finding in this section. It needs the gold set before it can be claimed.</w:t>
+        <w:t xml:space="preserve"> rather than by language coverage. It did not survive the gold set (§VI-A.2): on verified code-mixed questions LaBSE reaches 0.239, against 0.500 for BM25 and 0.556 for script-aware fusion. We have not tested why the probes favoured it; the verification pass respelled the code-mixed questions, which changed their wording as well as their quality, so the two cannot be separated.</w:t>
       </w:r>
     </w:p>
     <w:p>
@@ -15085,7 +15339,7 @@
           <w:rFonts w:ascii="Times New Roman" w:hAnsi="Times New Roman"/>
           <w:sz w:val="20"/>
         </w:rPr>
-        <w:t>We analyse twenty failures drawn against a fixed taxonomy of ten categories — code-mixing, transliteration variation, named entities, amounts, dates, ambiguity, near-duplicate schemes across schemes, the cross-lingual gap, long-tail schemes, and short queries — with two cases per category.</w:t>
+        <w:t>We analyse failures drawn against a fixed taxonomy of ten categories — code-mixing, transliteration variation, named entities, amounts, dates, ambiguity, near-duplicate schemes, the cross-lingual gap, long-tail schemes, and short queries — taking at most two cases per category.</w:t>
       </w:r>
     </w:p>
     <w:p>
@@ -15113,35 +15367,7 @@
           <w:rFonts w:ascii="Times New Roman" w:hAnsi="Times New Roman"/>
           <w:sz w:val="20"/>
         </w:rPr>
-        <w:t xml:space="preserve">Each case is recorded as a structured record — query, gold passages, the ranked output of each system under comparison, the generated answer, a diagnosis, and the component judged to have failed — and is committed to the repository as </w:t>
-      </w:r>
-      <w:r>
-        <w:rPr>
-          <w:rFonts w:ascii="Consolas" w:hAnsi="Consolas"/>
-          <w:sz w:val="17"/>
-        </w:rPr>
-        <w:t>evals/errors.jsonl</w:t>
-      </w:r>
-      <w:r>
-        <w:rPr>
-          <w:rFonts w:ascii="Times New Roman" w:hAnsi="Times New Roman"/>
-          <w:sz w:val="20"/>
-        </w:rPr>
-        <w:t xml:space="preserve"> alongside the rendered report. The diagnosis field names one of retrieval, generation, answerability or data, so that the distribution of failures across components is itself a result rather than an impression.</w:t>
-      </w:r>
-    </w:p>
-    <w:p>
-      <w:pPr>
-        <w:spacing w:before="200" w:after="80"/>
-        <w:jc w:val="left"/>
-      </w:pPr>
-      <w:r>
-        <w:rPr>
-          <w:rFonts w:ascii="Times New Roman" w:hAnsi="Times New Roman"/>
-          <w:i/>
-          <w:sz w:val="20"/>
-        </w:rPr>
-        <w:t>B. What the cases showed</w:t>
+        <w:t>Each case is recorded as a structured record — query, gold passages, the ranked output of every system, a diagnosis, and the component judged to have failed — and committed alongside its rendered report.</w:t>
       </w:r>
     </w:p>
     <w:p>
@@ -15155,22 +15381,63 @@
           <w:rFonts w:ascii="Times New Roman" w:hAnsi="Times New Roman"/>
           <w:sz w:val="20"/>
         </w:rPr>
-        <w:t xml:space="preserve">The dominant failure mode is not subtle. In the majority of the twenty cases the gold passage was never retrieved at all, and the top-ranked hit was the correct scheme in the </w:t>
-      </w:r>
+        <w:t>We ran the selection twice. The first run, twenty cases over plain RRF on the unverified questions (</w:t>
+      </w:r>
+      <w:r>
+        <w:rPr>
+          <w:rFonts w:ascii="Consolas" w:hAnsi="Consolas"/>
+          <w:sz w:val="17"/>
+        </w:rPr>
+        <w:t>evals/errors.jsonl</w:t>
+      </w:r>
+      <w:r>
+        <w:rPr>
+          <w:rFonts w:ascii="Times New Roman" w:hAnsi="Times New Roman"/>
+          <w:sz w:val="20"/>
+        </w:rPr>
+        <w:t>), is where the paper's main result came from, and §VII-C tells that story. Verification then rewrote every one of its twenty questions, so we repeated the selection on the sealed test split over the system the paper recommends, script-aware fusion (</w:t>
+      </w:r>
+      <w:r>
+        <w:rPr>
+          <w:rFonts w:ascii="Consolas" w:hAnsi="Consolas"/>
+          <w:sz w:val="17"/>
+        </w:rPr>
+        <w:t>evals/errors-test.jsonl</w:t>
+      </w:r>
+      <w:r>
+        <w:rPr>
+          <w:rFonts w:ascii="Times New Roman" w:hAnsi="Times New Roman"/>
+          <w:sz w:val="20"/>
+        </w:rPr>
+        <w:t xml:space="preserve">, </w:t>
+      </w:r>
+      <w:r>
+        <w:rPr>
+          <w:rFonts w:ascii="Consolas" w:hAnsi="Consolas"/>
+          <w:sz w:val="17"/>
+        </w:rPr>
+        <w:t>evals/report-errors-test.txt</w:t>
+      </w:r>
+      <w:r>
+        <w:rPr>
+          <w:rFonts w:ascii="Times New Roman" w:hAnsi="Times New Roman"/>
+          <w:sz w:val="20"/>
+        </w:rPr>
+        <w:t>). §VII-B reports that run. It yields 15 cases across 8 categories rather than 20 across 10: the near-duplicate and short-query categories produce no case under the rule, and we do not relax the rule to fill them.</w:t>
+      </w:r>
+    </w:p>
+    <w:p>
+      <w:pPr>
+        <w:spacing w:before="200" w:after="80"/>
+        <w:jc w:val="left"/>
+      </w:pPr>
       <w:r>
         <w:rPr>
           <w:rFonts w:ascii="Times New Roman" w:hAnsi="Times New Roman"/>
           <w:i/>
           <w:sz w:val="20"/>
         </w:rPr>
-        <w:t>wrong language</w:t>
-      </w:r>
-      <w:r>
-        <w:rPr>
-          <w:rFonts w:ascii="Times New Roman" w:hAnsi="Times New Roman"/>
-          <w:sz w:val="20"/>
-        </w:rPr>
-        <w:t>: a Hinglish query about the National Health Mission's untied grants returns the English article when the gold passage is the Hindi one, and an English query about Sukanya Samriddhi eligibility does the same in reverse. The system was not confused about the topic. It was confused about nothing at all — it had simply never been able to see the passage that would have answered the question.</w:t>
+        <w:t>B. What the verified cases show</w:t>
       </w:r>
     </w:p>
     <w:p>
@@ -15182,9 +15449,32 @@
       <w:r>
         <w:rPr>
           <w:rFonts w:ascii="Times New Roman" w:hAnsi="Times New Roman"/>
-          <w:sz w:val="20"/>
-        </w:rPr>
-        <w:t>This concentrates the error in one component. Categories that appear linguistically distinct in the taxonomy — code-mixing, transliteration variation, the cross-lingual gap — turn out to share a single mechanism once the retrieved lists are read side by side, and that mechanism is a retriever that cannot cross a script boundary. In 16 of the 20 cases the gold passage is not returned at any rank, and all 20 are diagnosed as retrieval failures.</w:t>
+          <w:b/>
+          <w:sz w:val="20"/>
+        </w:rPr>
+        <w:t>The right scheme, the wrong passage.</w:t>
+      </w:r>
+      <w:r>
+        <w:rPr>
+          <w:rFonts w:ascii="Times New Roman" w:hAnsi="Times New Roman"/>
+          <w:sz w:val="20"/>
+        </w:rPr>
+        <w:t xml:space="preserve"> In 12 of the 15 cases script-aware fusion puts a passage from the correct scheme in its top five; what it misses is the one passage that states the fact. Often that passage is in the other language: a Hinglish question about how many documents a Sukanya Samriddhi account needs retrieves five English Sukanya passages, and the only statement of the answer is in the Hindi article. The three remaining cases retrieve the wrong scheme altogether, one of them because the question spells Aadhaar as </w:t>
+      </w:r>
+      <w:r>
+        <w:rPr>
+          <w:rFonts w:ascii="Times New Roman" w:hAnsi="Times New Roman"/>
+          <w:i/>
+          <w:sz w:val="20"/>
+        </w:rPr>
+        <w:t>adhar</w:t>
+      </w:r>
+      <w:r>
+        <w:rPr>
+          <w:rFonts w:ascii="Times New Roman" w:hAnsi="Times New Roman"/>
+          <w:sz w:val="20"/>
+        </w:rPr>
+        <w:t>.</w:t>
       </w:r>
     </w:p>
     <w:p>
@@ -15199,43 +15489,14 @@
           <w:b/>
           <w:sz w:val="20"/>
         </w:rPr>
-        <w:t>That unanimity is a property of the selection, not a finding about the generator.</w:t>
-      </w:r>
-      <w:r>
-        <w:rPr>
-          <w:rFonts w:ascii="Times New Roman" w:hAnsi="Times New Roman"/>
-          <w:sz w:val="20"/>
-        </w:rPr>
-        <w:t xml:space="preserve"> The cases are drawn from retrieval failures against a taxonomy of retrieval phenomena, so a generation error has no route into this sample. It would be a mistake to read "all 20 are retrieval" as evidence that the generator is sound, and §VI-G.1 shows the opposite: given the gold passage and nothing to find, the generator still loses 0.597 token-F1, three times what retrieval loses. The error analysis says where </w:t>
-      </w:r>
-      <w:r>
-        <w:rPr>
-          <w:rFonts w:ascii="Times New Roman" w:hAnsi="Times New Roman"/>
-          <w:i/>
-          <w:sz w:val="20"/>
-        </w:rPr>
-        <w:t>retrieval</w:t>
-      </w:r>
-      <w:r>
-        <w:rPr>
-          <w:rFonts w:ascii="Times New Roman" w:hAnsi="Times New Roman"/>
-          <w:sz w:val="20"/>
-        </w:rPr>
-        <w:t xml:space="preserve"> fails and why; the oracle arm is what says how the two components compare.</w:t>
-      </w:r>
-    </w:p>
-    <w:p>
-      <w:pPr>
-        <w:spacing w:before="200" w:after="80"/>
-        <w:jc w:val="left"/>
-      </w:pPr>
-      <w:r>
-        <w:rPr>
-          <w:rFonts w:ascii="Times New Roman" w:hAnsi="Times New Roman"/>
-          <w:i/>
-          <w:sz w:val="20"/>
-        </w:rPr>
-        <w:t>C. The case that produced the paper's main result</w:t>
+        <w:t>Two failures are the gold set's, not the retriever's.</w:t>
+      </w:r>
+      <w:r>
+        <w:rPr>
+          <w:rFonts w:ascii="Times New Roman" w:hAnsi="Times New Roman"/>
+          <w:sz w:val="20"/>
+        </w:rPr>
+        <w:t xml:space="preserve"> The automatic diagnosis attributes all 15 cases to retrieval, and reading them corrects that twice. In E08 the retriever's first result states the answer — ₹17,000 crore set aside for Skill India in the 2017–18 budget — but the 25% overlap between adjacent passages copied that sentence into a passage the gold set does not list, so a correct retrieval is scored as a miss. In E04 the gold set omits the English passage that also states the 21-year maturity of a Sukanya account; that one remains a real miss, since the passage was not retrieved either. Verification added other-language passages to 73 items, and these two show it did not find every one. Overlap-duplicated sentences are a systematic source of such gaps, and resolving gold evidence to sentences rather than passages would close them.</w:t>
       </w:r>
     </w:p>
     <w:p>
@@ -15247,9 +15508,46 @@
       <w:r>
         <w:rPr>
           <w:rFonts w:ascii="Times New Roman" w:hAnsi="Times New Roman"/>
-          <w:sz w:val="20"/>
-        </w:rPr>
-        <w:t>One case (E02 in the committed report) is worth stating in full, because the central contribution of this paper came out of it rather than out of a metric.</w:t>
+          <w:b/>
+          <w:sz w:val="20"/>
+        </w:rPr>
+        <w:t>One failure is a defect in script-aware fusion, and fixing it does not help.</w:t>
+      </w:r>
+      <w:r>
+        <w:rPr>
+          <w:rFonts w:ascii="Times New Roman" w:hAnsi="Times New Roman"/>
+          <w:sz w:val="20"/>
+        </w:rPr>
+        <w:t xml:space="preserve"> In E01 the top result is a Hindi passage about the Soil Health Card, returned for a Romanized question about the Antyodaya ration. BM25 reached that passage through the one Latin word it quotes, </w:t>
+      </w:r>
+      <w:r>
+        <w:rPr>
+          <w:rFonts w:ascii="Times New Roman" w:hAnsi="Times New Roman"/>
+          <w:i/>
+          <w:sz w:val="20"/>
+        </w:rPr>
+        <w:t>Card</w:t>
+      </w:r>
+      <w:r>
+        <w:rPr>
+          <w:rFonts w:ascii="Times New Roman" w:hAnsi="Times New Roman"/>
+          <w:sz w:val="20"/>
+        </w:rPr>
+        <w:t>, and script-aware fusion then doubled the score, since for a Latin query a Devanagari passage counts as ineligible for a lexical vote even when it received one. Counting a cast vote as eligible is the obvious correction. Because the defect was found on the test split, we decided on dev: there the correction is worse, −0.026 Recall@5 overall and −0.093 cross-lingual, neither significant, and the test split moves the same way (</w:t>
+      </w:r>
+      <w:r>
+        <w:rPr>
+          <w:rFonts w:ascii="Consolas" w:hAnsi="Consolas"/>
+          <w:sz w:val="17"/>
+        </w:rPr>
+        <w:t>evals/report-observed-votes.txt</w:t>
+      </w:r>
+      <w:r>
+        <w:rPr>
+          <w:rFonts w:ascii="Times New Roman" w:hAnsi="Times New Roman"/>
+          <w:sz w:val="20"/>
+        </w:rPr>
+        <w:t>). Across both splits it changes six queries, losing five and gaining one; in four of the five losses BM25 had reached a cross-script gold passage through a year or number in the question, and in the fifth through a Latin acronym. A cast cross-script vote is usually real evidence, so the committed rule stays, and E01 is its price.</w:t>
       </w:r>
     </w:p>
     <w:p>
@@ -15261,9 +15559,17 @@
       <w:r>
         <w:rPr>
           <w:rFonts w:ascii="Times New Roman" w:hAnsi="Times New Roman"/>
-          <w:sz w:val="20"/>
-        </w:rPr>
-        <w:t xml:space="preserve">The aggregate tables showed hybrid fusion performing </w:t>
+          <w:b/>
+          <w:sz w:val="20"/>
+        </w:rPr>
+        <w:t>One failure is in the corpus.</w:t>
+      </w:r>
+      <w:r>
+        <w:rPr>
+          <w:rFonts w:ascii="Times New Roman" w:hAnsi="Times New Roman"/>
+          <w:sz w:val="20"/>
+        </w:rPr>
+        <w:t xml:space="preserve"> E06 asks which film based on the Swachh Bharat Mission was released in August 2023. The only passage stating it belongs to the </w:t>
       </w:r>
       <w:r>
         <w:rPr>
@@ -15271,14 +15577,14 @@
           <w:i/>
           <w:sz w:val="20"/>
         </w:rPr>
-        <w:t>worse</w:t>
-      </w:r>
-      <w:r>
-        <w:rPr>
-          <w:rFonts w:ascii="Times New Roman" w:hAnsi="Times New Roman"/>
-          <w:sz w:val="20"/>
-        </w:rPr>
-        <w:t xml:space="preserve"> than dense retrieval alone on exactly the queries hybrid retrieval was supposed to help with, and gave no indication why. Both components were behaving as documented; the fusion was implemented correctly against its own specification; the α sweep found no interior setting significantly better than the better of its two endpoints, which reads as a clean negative result. Read as a table, the finding was that hybrid retrieval does not help here.</w:t>
+        <w:t>Beti Bachao</w:t>
+      </w:r>
+      <w:r>
+        <w:rPr>
+          <w:rFonts w:ascii="Times New Roman" w:hAnsi="Times New Roman"/>
+          <w:sz w:val="20"/>
+        </w:rPr>
+        <w:t xml:space="preserve"> article, which mentions the film in passing, so a question that names Swachh Bharat retrieves Swachh Bharat passages. No retriever should be expected to find it.</w:t>
       </w:r>
     </w:p>
     <w:p>
@@ -15290,9 +15596,32 @@
       <w:r>
         <w:rPr>
           <w:rFonts w:ascii="Times New Roman" w:hAnsi="Times New Roman"/>
-          <w:sz w:val="20"/>
-        </w:rPr>
-        <w:t>Reading the twenty cases gave the actual explanation. Of the twenty failures, the dense retriever alone had returned the gold passage in eight. Plain Reciprocal Rank Fusion lost all eight. A fusion method that discards every case its stronger component got right is not a method with a disappointing coefficient; it is a method whose arithmetic is wrong for this setting, and no amount of sweeping α would have revealed that, because α was never the problem.</w:t>
+          <w:b/>
+          <w:sz w:val="20"/>
+        </w:rPr>
+        <w:t>The taxonomy tagger is not always right.</w:t>
+      </w:r>
+      <w:r>
+        <w:rPr>
+          <w:rFonts w:ascii="Times New Roman" w:hAnsi="Times New Roman"/>
+          <w:sz w:val="20"/>
+        </w:rPr>
+        <w:t xml:space="preserve"> E07 is filed under </w:t>
+      </w:r>
+      <w:r>
+        <w:rPr>
+          <w:rFonts w:ascii="Times New Roman" w:hAnsi="Times New Roman"/>
+          <w:i/>
+          <w:sz w:val="20"/>
+        </w:rPr>
+        <w:t>amounts</w:t>
+      </w:r>
+      <w:r>
+        <w:rPr>
+          <w:rFonts w:ascii="Times New Roman" w:hAnsi="Times New Roman"/>
+          <w:sz w:val="20"/>
+        </w:rPr>
+        <w:t xml:space="preserve"> because its question contains a year; it asks which movement inspired Atmanirbhar Bharat. The categories are assigned by heuristic, and a case's category is a pointer for reading it, not a finding.</w:t>
       </w:r>
     </w:p>
     <w:p>
@@ -15304,28 +15633,22 @@
       <w:r>
         <w:rPr>
           <w:rFonts w:ascii="Times New Roman" w:hAnsi="Times New Roman"/>
-          <w:sz w:val="20"/>
-        </w:rPr>
-        <w:t>The mechanism is developed in §VIII. The methodological point belongs here: the aggregate metric was not merely uninformative about the cause, it pointed away from it. Twenty cases, selected by rule and read in full, were what turned a negative result into a positive one.</w:t>
+          <w:b/>
+          <w:sz w:val="20"/>
+        </w:rPr>
+        <w:t>That this sample is all retrieval is a property of the selection, not a finding about the generator.</w:t>
+      </w:r>
+      <w:r>
+        <w:rPr>
+          <w:rFonts w:ascii="Times New Roman" w:hAnsi="Times New Roman"/>
+          <w:sz w:val="20"/>
+        </w:rPr>
+        <w:t xml:space="preserve"> The cases are drawn from retrieval failures against a taxonomy of retrieval phenomena, so a generation error has no route into this sample. §VI-G.1 makes the comparison the error analysis cannot: given the gold passage and nothing to find, the generator still loses more than retrieval does.</w:t>
       </w:r>
     </w:p>
     <w:p>
       <w:pPr>
         <w:spacing w:before="200" w:after="80"/>
-        <w:jc w:val="center"/>
-      </w:pPr>
-      <w:r>
-        <w:rPr>
-          <w:rFonts w:ascii="Times New Roman" w:hAnsi="Times New Roman"/>
-          <w:smallCaps/>
-          <w:sz w:val="20"/>
-        </w:rPr>
-        <w:t>VIII. Discussion</w:t>
-      </w:r>
-    </w:p>
-    <w:p>
-      <w:pPr>
-        <w:spacing w:before="200" w:after="80"/>
         <w:jc w:val="left"/>
       </w:pPr>
       <w:r>
@@ -15334,7 +15657,7 @@
           <w:i/>
           <w:sz w:val="20"/>
         </w:rPr>
-        <w:t>A. Why fusion fails across a script boundary</w:t>
+        <w:t>C. The case that produced the paper's main result</w:t>
       </w:r>
     </w:p>
     <w:p>
@@ -15348,21 +15671,21 @@
           <w:rFonts w:ascii="Times New Roman" w:hAnsi="Times New Roman"/>
           <w:sz w:val="20"/>
         </w:rPr>
-        <w:t xml:space="preserve">Rank fusion rests on an assumption that is usually harmless and is false here. Combining two retrievers is worthwhile when their errors are complementary — when each recovers documents the other misses — and rank-based fusion in particular treats agreement between retrievers as evidence. A document returned by both systems accumulates two contributions; one returned by a single system accumulates one. Under Reciprocal Rank Fusion the fused score is </w:t>
+        <w:t xml:space="preserve">One case (E02 in </w:t>
       </w:r>
       <w:r>
         <w:rPr>
           <w:rFonts w:ascii="Consolas" w:hAnsi="Consolas"/>
           <w:sz w:val="17"/>
         </w:rPr>
-        <w:t>Σᵢ 1/(k + rankᵢ)</w:t>
-      </w:r>
-      <w:r>
-        <w:rPr>
-          <w:rFonts w:ascii="Times New Roman" w:hAnsi="Times New Roman"/>
-          <w:sz w:val="20"/>
-        </w:rPr>
-        <w:t>, summed over the systems that returned the document, and the document found by one system alone is therefore scored at roughly half the document found by both.</w:t>
+        <w:t>evals/report-errors.txt</w:t>
+      </w:r>
+      <w:r>
+        <w:rPr>
+          <w:rFonts w:ascii="Times New Roman" w:hAnsi="Times New Roman"/>
+          <w:sz w:val="20"/>
+        </w:rPr>
+        <w:t>) is worth stating in full, because the central contribution of this paper came out of it rather than out of a metric.</w:t>
       </w:r>
     </w:p>
     <w:p>
@@ -15376,7 +15699,7 @@
           <w:rFonts w:ascii="Times New Roman" w:hAnsi="Times New Roman"/>
           <w:sz w:val="20"/>
         </w:rPr>
-        <w:t xml:space="preserve">Across a script boundary this arithmetic silently changes meaning. A lexical retriever matching surface tokens has, by construction, </w:t>
+        <w:t xml:space="preserve">The aggregate tables showed hybrid fusion performing </w:t>
       </w:r>
       <w:r>
         <w:rPr>
@@ -15384,14 +15707,14 @@
           <w:i/>
           <w:sz w:val="20"/>
         </w:rPr>
-        <w:t>zero</w:t>
-      </w:r>
-      <w:r>
-        <w:rPr>
-          <w:rFonts w:ascii="Times New Roman" w:hAnsi="Times New Roman"/>
-          <w:sz w:val="20"/>
-        </w:rPr>
-        <w:t xml:space="preserve"> recall over passages written in a script the query does not use: a Devanagari query and a Latin-script passage share essentially no tokens, so BM25 cannot return that passage at any rank, for any query, however relevant it is. The lexical retriever's silence about a cross-script passage is not evidence against that passage. It is not evidence at all.</w:t>
+        <w:t>worse</w:t>
+      </w:r>
+      <w:r>
+        <w:rPr>
+          <w:rFonts w:ascii="Times New Roman" w:hAnsi="Times New Roman"/>
+          <w:sz w:val="20"/>
+        </w:rPr>
+        <w:t xml:space="preserve"> than dense retrieval alone on exactly the queries hybrid retrieval was supposed to help with, and gave no indication why. Both components were behaving as documented; the fusion was implemented correctly against its own specification; the α sweep found no interior setting significantly better than the better of its two endpoints, which reads as a clean negative result. Read as a table, the finding was that hybrid retrieval does not help here.</w:t>
       </w:r>
     </w:p>
     <w:p>
@@ -15405,37 +15728,7 @@
           <w:rFonts w:ascii="Times New Roman" w:hAnsi="Times New Roman"/>
           <w:sz w:val="20"/>
         </w:rPr>
-        <w:t xml:space="preserve">Plain RRF cannot tell the difference between these two situations, because the sum is taken over the systems that </w:t>
-      </w:r>
-      <w:r>
-        <w:rPr>
-          <w:rFonts w:ascii="Times New Roman" w:hAnsi="Times New Roman"/>
-          <w:i/>
-          <w:sz w:val="20"/>
-        </w:rPr>
-        <w:t>did</w:t>
-      </w:r>
-      <w:r>
-        <w:rPr>
-          <w:rFonts w:ascii="Times New Roman" w:hAnsi="Times New Roman"/>
-          <w:sz w:val="20"/>
-        </w:rPr>
-        <w:t xml:space="preserve"> return the document rather than over the systems that </w:t>
-      </w:r>
-      <w:r>
-        <w:rPr>
-          <w:rFonts w:ascii="Times New Roman" w:hAnsi="Times New Roman"/>
-          <w:i/>
-          <w:sz w:val="20"/>
-        </w:rPr>
-        <w:t>could</w:t>
-      </w:r>
-      <w:r>
-        <w:rPr>
-          <w:rFonts w:ascii="Times New Roman" w:hAnsi="Times New Roman"/>
-          <w:sz w:val="20"/>
-        </w:rPr>
-        <w:t>. A cross-script passage is docked a full contribution for the lexical retriever's blindness, and it is docked it relative to same-script passages whose lexical votes were possible. The penalty is therefore applied precisely where it is least deserved: the cross-lingual case is the one in which the dense retriever is the only informative signal, and it is the case in which fusion most aggressively discounts it.</w:t>
+        <w:t>Reading the twenty cases gave the actual explanation. (They were drawn from the unverified questions, and verification has since rewritten all twenty; the mechanism they exposed is structural, and §VI-A confirms it on the verified set.) Of the twenty failures, the dense retriever alone had returned the gold passage in eight. Plain Reciprocal Rank Fusion lost all eight. A fusion method that discards every case its stronger component got right is not a method with a disappointing coefficient; it is a method whose arithmetic is wrong for this setting, and no amount of sweeping α would have revealed that, because α was never the problem.</w:t>
       </w:r>
     </w:p>
     <w:p>
@@ -15449,27 +15742,26 @@
           <w:rFonts w:ascii="Times New Roman" w:hAnsi="Times New Roman"/>
           <w:sz w:val="20"/>
         </w:rPr>
-        <w:t xml:space="preserve">It is worth being precise about what is and is not new. This behaviour is not a bug in RRF, which was designed for monolingual settings in which every retriever can reach every document, and under which discounting single-system evidence is sensible. Nor is the underlying difficulty unknown: work on multilingual retrieval has previously restricted sparse retrieval to same-language candidates when combining it with dense retrieval, which avoids the problem by not creating it. Our contribution is not the observation that sparse retrievers struggle across languages. It is the characterisation of </w:t>
-      </w:r>
-      <w:r>
-        <w:rPr>
-          <w:rFonts w:ascii="Times New Roman" w:hAnsi="Times New Roman"/>
-          <w:i/>
-          <w:sz w:val="20"/>
-        </w:rPr>
-        <w:t>how the fusion arithmetic converts that limitation into an active penalty</w:t>
-      </w:r>
-      <w:r>
-        <w:rPr>
-          <w:rFonts w:ascii="Times New Roman" w:hAnsi="Times New Roman"/>
-          <w:sz w:val="20"/>
-        </w:rPr>
-        <w:t>, and a minimal correction stated in those terms.</w:t>
+        <w:t>The mechanism is developed in §VIII. The methodological point belongs here: the aggregate metric was not merely uninformative about the cause, it pointed away from it. Twenty cases, selected by rule and read in full, were what turned a negative result into a positive one.</w:t>
       </w:r>
     </w:p>
     <w:p>
       <w:pPr>
         <w:spacing w:before="200" w:after="80"/>
+        <w:jc w:val="center"/>
+      </w:pPr>
+      <w:r>
+        <w:rPr>
+          <w:rFonts w:ascii="Times New Roman" w:hAnsi="Times New Roman"/>
+          <w:smallCaps/>
+          <w:sz w:val="20"/>
+        </w:rPr>
+        <w:t>VIII. Discussion</w:t>
+      </w:r>
+    </w:p>
+    <w:p>
+      <w:pPr>
+        <w:spacing w:before="200" w:after="80"/>
         <w:jc w:val="left"/>
       </w:pPr>
       <w:r>
@@ -15478,7 +15770,7 @@
           <w:i/>
           <w:sz w:val="20"/>
         </w:rPr>
-        <w:t>B. Script-aware fusion</w:t>
+        <w:t>A. Why fusion fails across a script boundary</w:t>
       </w:r>
     </w:p>
     <w:p>
@@ -15492,22 +15784,21 @@
           <w:rFonts w:ascii="Times New Roman" w:hAnsi="Times New Roman"/>
           <w:sz w:val="20"/>
         </w:rPr>
-        <w:t xml:space="preserve">The correction follows directly from the diagnosis. We score each passage over the retrievers that were </w:t>
-      </w:r>
-      <w:r>
-        <w:rPr>
-          <w:rFonts w:ascii="Times New Roman" w:hAnsi="Times New Roman"/>
-          <w:i/>
-          <w:sz w:val="20"/>
-        </w:rPr>
-        <w:t>eligible</w:t>
-      </w:r>
-      <w:r>
-        <w:rPr>
-          <w:rFonts w:ascii="Times New Roman" w:hAnsi="Times New Roman"/>
-          <w:sz w:val="20"/>
-        </w:rPr>
-        <w:t xml:space="preserve"> to return it, rather than over those that did, treating a lexical retriever as ineligible for a passage whose script differs from the query's. A cross-script candidate is then judged on the dense contribution alone — the only evidence that ever existed about it — instead of being penalised for a vote that was never possible.</w:t>
+        <w:t xml:space="preserve">Rank fusion rests on an assumption that is usually harmless and is false here. Combining two retrievers is worthwhile when their errors are complementary — when each recovers documents the other misses — and rank-based fusion in particular treats agreement between retrievers as evidence. A document returned by both systems accumulates two contributions; one returned by a single system accumulates one. Under Reciprocal Rank Fusion the fused score is </w:t>
+      </w:r>
+      <w:r>
+        <w:rPr>
+          <w:rFonts w:ascii="Consolas" w:hAnsi="Consolas"/>
+          <w:sz w:val="17"/>
+        </w:rPr>
+        <w:t>Σᵢ 1/(k + rankᵢ)</w:t>
+      </w:r>
+      <w:r>
+        <w:rPr>
+          <w:rFonts w:ascii="Times New Roman" w:hAnsi="Times New Roman"/>
+          <w:sz w:val="20"/>
+        </w:rPr>
+        <w:t>, summed over the systems that returned the document, and the document found by one system alone is therefore scored at roughly half the document found by both.</w:t>
       </w:r>
     </w:p>
     <w:p>
@@ -15521,7 +15812,22 @@
           <w:rFonts w:ascii="Times New Roman" w:hAnsi="Times New Roman"/>
           <w:sz w:val="20"/>
         </w:rPr>
-        <w:t>The change is small, requires no training and no tuning, and adds one lookup per candidate. On the sealed test split of the verified gold set it takes cross-lingual Recall@5 from 0.274 under plain RRF to 0.685 (paired randomization test, p = 0.0001, n = 62), and overall Recall@5 from 0.618 to 0.750 (p = 0.0001, n = 216). On the probe set where it was found, the same correction took cross-lingual recall from 0.022 to 0.153.</w:t>
+        <w:t xml:space="preserve">Across a script boundary this arithmetic silently changes meaning. A lexical retriever matching surface tokens has, by construction, </w:t>
+      </w:r>
+      <w:r>
+        <w:rPr>
+          <w:rFonts w:ascii="Times New Roman" w:hAnsi="Times New Roman"/>
+          <w:i/>
+          <w:sz w:val="20"/>
+        </w:rPr>
+        <w:t>zero</w:t>
+      </w:r>
+      <w:r>
+        <w:rPr>
+          <w:rFonts w:ascii="Times New Roman" w:hAnsi="Times New Roman"/>
+          <w:sz w:val="20"/>
+        </w:rPr>
+        <w:t xml:space="preserve"> recall over passages written in a script the query does not use: a Devanagari query and a Latin-script passage share essentially no tokens, so BM25 cannot return that passage at any rank, for any query, however relevant it is. The lexical retriever's silence about a cross-script passage is not evidence against that passage. It is not evidence at all.</w:t>
       </w:r>
     </w:p>
     <w:p>
@@ -15535,7 +15841,37 @@
           <w:rFonts w:ascii="Times New Roman" w:hAnsi="Times New Roman"/>
           <w:sz w:val="20"/>
         </w:rPr>
-        <w:t>The comparison against dense retrieval alone is the one that decides whether hybrid retrieval earns its place at all, and here the verified set is less generous than the probes were. Script-aware fusion beats e5-base alone by +0.030 overall on the test split (p = 0.052) and +0.027 on dev and test pooled (p = 0.021); by slice, the gain is significant only on code-mixed queries (+0.085, p = 0.0037), where Romanized questions carrying English scheme names give the lexical retriever something the dense one misses, and it is +0.024 on cross-lingual queries (p = 0.62). The honest reading is that the correction removes a harm plain fusion introduces, and that once removed, fusing adds a small gain over a strong multilingual dense retriever, concentrated in code-mixed queries.</w:t>
+        <w:t xml:space="preserve">Plain RRF cannot tell the difference between these two situations, because the sum is taken over the systems that </w:t>
+      </w:r>
+      <w:r>
+        <w:rPr>
+          <w:rFonts w:ascii="Times New Roman" w:hAnsi="Times New Roman"/>
+          <w:i/>
+          <w:sz w:val="20"/>
+        </w:rPr>
+        <w:t>did</w:t>
+      </w:r>
+      <w:r>
+        <w:rPr>
+          <w:rFonts w:ascii="Times New Roman" w:hAnsi="Times New Roman"/>
+          <w:sz w:val="20"/>
+        </w:rPr>
+        <w:t xml:space="preserve"> return the document rather than over the systems that </w:t>
+      </w:r>
+      <w:r>
+        <w:rPr>
+          <w:rFonts w:ascii="Times New Roman" w:hAnsi="Times New Roman"/>
+          <w:i/>
+          <w:sz w:val="20"/>
+        </w:rPr>
+        <w:t>could</w:t>
+      </w:r>
+      <w:r>
+        <w:rPr>
+          <w:rFonts w:ascii="Times New Roman" w:hAnsi="Times New Roman"/>
+          <w:sz w:val="20"/>
+        </w:rPr>
+        <w:t>. A cross-script passage is docked a full contribution for the lexical retriever's blindness, and it is docked it relative to same-script passages whose lexical votes were possible. The penalty is therefore applied precisely where it is least deserved: the cross-lingual case is the one in which the dense retriever is the only informative signal, and it is the case in which fusion most aggressively discounts it.</w:t>
       </w:r>
     </w:p>
     <w:p>
@@ -15549,7 +15885,22 @@
           <w:rFonts w:ascii="Times New Roman" w:hAnsi="Times New Roman"/>
           <w:sz w:val="20"/>
         </w:rPr>
-        <w:t>This also revises a negative result reported earlier in the same work, though less than we first claimed. The α sweep found no interior weighting that beat both endpoints, and still finds none on the verified set (best α = 0.1 at 0.720 against 0.720 for pure dense, test split). We had read the script-aware result as showing that hybrid retrieval does beat its components once fusion stops penalising cross-script passages. On the verified set that holds for code-mixed queries and is within noise elsewhere.</w:t>
+        <w:t xml:space="preserve">It is worth being precise about what is and is not new. This behaviour is not a bug in RRF, which was designed for monolingual settings in which every retriever can reach every document, and under which discounting single-system evidence is sensible. Nor is the underlying difficulty unknown: work on multilingual retrieval has previously restricted sparse retrieval to same-language candidates when combining it with dense retrieval, which avoids the problem by not creating it. Our contribution is not the observation that sparse retrievers struggle across languages. It is the characterisation of </w:t>
+      </w:r>
+      <w:r>
+        <w:rPr>
+          <w:rFonts w:ascii="Times New Roman" w:hAnsi="Times New Roman"/>
+          <w:i/>
+          <w:sz w:val="20"/>
+        </w:rPr>
+        <w:t>how the fusion arithmetic converts that limitation into an active penalty</w:t>
+      </w:r>
+      <w:r>
+        <w:rPr>
+          <w:rFonts w:ascii="Times New Roman" w:hAnsi="Times New Roman"/>
+          <w:sz w:val="20"/>
+        </w:rPr>
+        <w:t>, and a minimal correction stated in those terms.</w:t>
       </w:r>
     </w:p>
     <w:p>
@@ -15563,7 +15914,7 @@
           <w:i/>
           <w:sz w:val="20"/>
         </w:rPr>
-        <w:t>C. The cost, stated plainly</w:t>
+        <w:t>B. Script-aware fusion</w:t>
       </w:r>
     </w:p>
     <w:p>
@@ -15577,7 +15928,22 @@
           <w:rFonts w:ascii="Times New Roman" w:hAnsi="Times New Roman"/>
           <w:sz w:val="20"/>
         </w:rPr>
-        <w:t>On the probe set the correction was a trade: monolingual Recall@5 fell from 0.712 to 0.668, a regression of 0.044 at p = 0.032, because removing the lexical double-vote discards agreement between retrievers exactly where both could see the same passage and agreement really was evidence.</w:t>
+        <w:t xml:space="preserve">The correction follows directly from the diagnosis. We score each passage over the retrievers that were </w:t>
+      </w:r>
+      <w:r>
+        <w:rPr>
+          <w:rFonts w:ascii="Times New Roman" w:hAnsi="Times New Roman"/>
+          <w:i/>
+          <w:sz w:val="20"/>
+        </w:rPr>
+        <w:t>eligible</w:t>
+      </w:r>
+      <w:r>
+        <w:rPr>
+          <w:rFonts w:ascii="Times New Roman" w:hAnsi="Times New Roman"/>
+          <w:sz w:val="20"/>
+        </w:rPr>
+        <w:t xml:space="preserve"> to return it, rather than over those that did, treating a lexical retriever as ineligible for a passage whose script differs from the query's. A cross-script candidate is then judged on the dense contribution alone — the only evidence that ever existed about it — instead of being penalised for a vote that was never possible.</w:t>
       </w:r>
     </w:p>
     <w:p>
@@ -15589,31 +15955,9 @@
       <w:r>
         <w:rPr>
           <w:rFonts w:ascii="Times New Roman" w:hAnsi="Times New Roman"/>
-          <w:b/>
-          <w:sz w:val="20"/>
-        </w:rPr>
-        <w:t>On the verified set there is no cost to state.</w:t>
-      </w:r>
-      <w:r>
-        <w:rPr>
-          <w:rFonts w:ascii="Times New Roman" w:hAnsi="Times New Roman"/>
-          <w:sz w:val="20"/>
-        </w:rPr>
-        <w:t xml:space="preserve"> Monolingual Recall@5 is 0.964 under both plain and script-aware fusion on the test split (p = 1.00), against 0.976 for dense alone (p = 0.75). The probe set's monolingual questions were built by lifting phrasing from their passages, which is the case where lexical agreement is most informative and discarding it costs most; real questions do not do that. We report the probe regression anyway, because on a deployment whose queries are overwhelmingly lexical-overlap monolingual ones it is the figure that would apply.</w:t>
-      </w:r>
-    </w:p>
-    <w:p>
-      <w:pPr>
-        <w:spacing w:before="200" w:after="80"/>
-        <w:jc w:val="left"/>
-      </w:pPr>
-      <w:r>
-        <w:rPr>
-          <w:rFonts w:ascii="Times New Roman" w:hAnsi="Times New Roman"/>
-          <w:i/>
-          <w:sz w:val="20"/>
-        </w:rPr>
-        <w:t>D. Retrieval is not the binding constraint here</w:t>
+          <w:sz w:val="20"/>
+        </w:rPr>
+        <w:t>The change is small, requires no training and no tuning, and adds one lookup per candidate. On the sealed test split of the verified gold set it takes cross-lingual Recall@5 from 0.274 under plain RRF to 0.685 (paired randomization test, p = 0.0001, n = 62), and overall Recall@5 from 0.618 to 0.750 (p = 0.0001, n = 216). On the probe set where it was found, the same correction took cross-lingual recall from 0.022 to 0.153.</w:t>
       </w:r>
     </w:p>
     <w:p>
@@ -15627,7 +15971,7 @@
           <w:rFonts w:ascii="Times New Roman" w:hAnsi="Times New Roman"/>
           <w:sz w:val="20"/>
         </w:rPr>
-        <w:t>The oracle arm of §VI-G puts a number on what this correction can be worth end to end, and it is smaller than the retrieval figures alone suggest. Given the gold passage and nothing to find, our generator reaches 0.403 token-F1; the full system reaches 0.210. Generation error is therefore 0.597 and retrieval error 0.193, a factor of three apart.</w:t>
+        <w:t>The comparison against dense retrieval alone is the one that decides whether hybrid retrieval earns its place at all, and here the verified set is less generous than the probes were. Script-aware fusion beats e5-base alone by +0.030 overall on the test split (p = 0.052) and +0.027 on dev and test pooled (p = 0.021); by slice, the gain is significant only on code-mixed queries (+0.085, p = 0.0037), where Romanized questions carrying English scheme names give the lexical retriever something the dense one misses, and it is +0.024 on cross-lingual queries (p = 0.62). The honest reading is that the correction removes a harm plain fusion introduces, and that once removed, fusing adds a small gain over a strong multilingual dense retriever, concentrated in code-mixed queries.</w:t>
       </w:r>
     </w:p>
     <w:p>
@@ -15641,22 +15985,21 @@
           <w:rFonts w:ascii="Times New Roman" w:hAnsi="Times New Roman"/>
           <w:sz w:val="20"/>
         </w:rPr>
-        <w:t xml:space="preserve">We report this because it constrains the practical claim rather than the scientific one. Script-aware fusion is a large improvement to retrieval, measured as retrieval. It does </w:t>
-      </w:r>
-      <w:r>
-        <w:rPr>
-          <w:rFonts w:ascii="Times New Roman" w:hAnsi="Times New Roman"/>
-          <w:b/>
-          <w:sz w:val="20"/>
-        </w:rPr>
-        <w:t>not</w:t>
-      </w:r>
-      <w:r>
-        <w:rPr>
-          <w:rFonts w:ascii="Times New Roman" w:hAnsi="Times New Roman"/>
-          <w:sz w:val="20"/>
-        </w:rPr>
-        <w:t xml:space="preserve"> produce a measurable improvement in answer quality over dense retrieval alone at this sample size: paired over the questions both arms answered, arm C exceeds arm B by 0.003 token-F1 (p = 0.89) and 0.026 citation support (p = 1.00).</w:t>
+        <w:t>This also revises a negative result reported earlier in the same work, though less than we first claimed. The α sweep found no interior weighting that beat both endpoints, and still finds none on the verified set (best α = 0.1 at 0.720 against 0.720 for pure dense, test split). We had read the script-aware result as showing that hybrid retrieval does beat its components once fusion stops penalising cross-script passages. On the verified set that holds for code-mixed queries and is within noise elsewhere.</w:t>
+      </w:r>
+    </w:p>
+    <w:p>
+      <w:pPr>
+        <w:spacing w:before="200" w:after="80"/>
+        <w:jc w:val="left"/>
+      </w:pPr>
+      <w:r>
+        <w:rPr>
+          <w:rFonts w:ascii="Times New Roman" w:hAnsi="Times New Roman"/>
+          <w:i/>
+          <w:sz w:val="20"/>
+        </w:rPr>
+        <w:t>C. The cost, stated plainly</w:t>
       </w:r>
     </w:p>
     <w:p>
@@ -15670,7 +16013,7 @@
           <w:rFonts w:ascii="Times New Roman" w:hAnsi="Times New Roman"/>
           <w:sz w:val="20"/>
         </w:rPr>
-        <w:t>The two facts fit together rather than conflicting. A generator losing 0.597 on its own is a noise floor that a retrieval gain has to clear to become visible downstream, and on 72 questions a gain of this size does not clear it. A reader who cares about end-to-end answer quality should know that fixing retrieval entirely would buy 0.193, while the generator is leaving 0.597 on the table.</w:t>
+        <w:t>On the probe set the correction was a trade: monolingual Recall@5 fell from 0.712 to 0.668, a regression of 0.044 at p = 0.032, because removing the lexical double-vote discards agreement between retrievers exactly where both could see the same passage and agreement really was evidence.</w:t>
       </w:r>
     </w:p>
     <w:p>
@@ -15682,9 +16025,17 @@
       <w:r>
         <w:rPr>
           <w:rFonts w:ascii="Times New Roman" w:hAnsi="Times New Roman"/>
-          <w:sz w:val="20"/>
-        </w:rPr>
-        <w:t>That ratio is a property of this configuration, not a general law. A 3B model at 4-bit quantization is a deliberately small generator, chosen so every number here is reproducible on commodity hardware, and a larger one would move the 0.597 without touching the 0.193. The point is that the two error sources have to be measured separately before either is optimised, which is precisely what the oracle arm is for and why the brief asks for it.</w:t>
+          <w:b/>
+          <w:sz w:val="20"/>
+        </w:rPr>
+        <w:t>On the verified set there is no cost to state.</w:t>
+      </w:r>
+      <w:r>
+        <w:rPr>
+          <w:rFonts w:ascii="Times New Roman" w:hAnsi="Times New Roman"/>
+          <w:sz w:val="20"/>
+        </w:rPr>
+        <w:t xml:space="preserve"> Monolingual Recall@5 is 0.964 under both plain and script-aware fusion on the test split (p = 1.00), against 0.976 for dense alone (p = 0.75). The probe set's monolingual questions were built by lifting phrasing from their passages, which is the case where lexical agreement is most informative and discarding it costs most; real questions do not do that. We report the probe regression anyway, because on a deployment whose queries are overwhelmingly lexical-overlap monolingual ones it is the figure that would apply.</w:t>
       </w:r>
     </w:p>
     <w:p>
@@ -15698,7 +16049,7 @@
           <w:i/>
           <w:sz w:val="20"/>
         </w:rPr>
-        <w:t>E. Where this generalises</w:t>
+        <w:t>D. Retrieval is not the binding constraint here</w:t>
       </w:r>
     </w:p>
     <w:p>
@@ -15712,22 +16063,7 @@
           <w:rFonts w:ascii="Times New Roman" w:hAnsi="Times New Roman"/>
           <w:sz w:val="20"/>
         </w:rPr>
-        <w:t xml:space="preserve">The mechanism is not about Hindi, and it is not about script. It appears wherever rank fusion is applied over retrievers with </w:t>
-      </w:r>
-      <w:r>
-        <w:rPr>
-          <w:rFonts w:ascii="Times New Roman" w:hAnsi="Times New Roman"/>
-          <w:i/>
-          <w:sz w:val="20"/>
-        </w:rPr>
-        <w:t>asymmetric coverage</w:t>
-      </w:r>
-      <w:r>
-        <w:rPr>
-          <w:rFonts w:ascii="Times New Roman" w:hAnsi="Times New Roman"/>
-          <w:sz w:val="20"/>
-        </w:rPr>
-        <w:t xml:space="preserve"> of the collection — where at least one retriever cannot, in principle, return part of what is being searched. Cross-script and cross-language pairs are the case studied here. The same structure arises when fusing a text retriever with one operating over images or tables, where each is blind to the other's modality; when fusing over access-controlled shards, where one retriever is permitted a subset of documents; and when fusing a domain-specialised index with a general one over a collection only partly covered by the specialist.</w:t>
+        <w:t>The oracle arm of §VI-G puts a number on what this correction can be worth end to end, and it is smaller than the retrieval figures alone suggest. Given the gold passage and nothing to find, our generator reaches 0.403 token-F1; the full system reaches 0.210. Generation error is therefore 0.597 and retrieval error 0.193, a factor of three apart.</w:t>
       </w:r>
     </w:p>
     <w:p>
@@ -15741,36 +16077,22 @@
           <w:rFonts w:ascii="Times New Roman" w:hAnsi="Times New Roman"/>
           <w:sz w:val="20"/>
         </w:rPr>
-        <w:t xml:space="preserve">The practical guidance is correspondingly simple, and is the form in which we would want this result used: before fusing retrievers, check their </w:t>
-      </w:r>
-      <w:r>
-        <w:rPr>
-          <w:rFonts w:ascii="Times New Roman" w:hAnsi="Times New Roman"/>
-          <w:i/>
-          <w:sz w:val="20"/>
-        </w:rPr>
-        <w:t>coverage</w:t>
-      </w:r>
-      <w:r>
-        <w:rPr>
-          <w:rFonts w:ascii="Times New Roman" w:hAnsi="Times New Roman"/>
-          <w:sz w:val="20"/>
-        </w:rPr>
-        <w:t>, not only their quality. Two retrievers of equal measured accuracy can combine well or destructively depending on whether each could have retrieved what the other did. Where coverage is asymmetric, fusion should be taken over the retrievers eligible for a candidate rather than those that returned it.</w:t>
-      </w:r>
-    </w:p>
-    <w:p>
-      <w:pPr>
-        <w:spacing w:before="200" w:after="80"/>
-        <w:jc w:val="center"/>
-      </w:pPr>
-      <w:r>
-        <w:rPr>
-          <w:rFonts w:ascii="Times New Roman" w:hAnsi="Times New Roman"/>
-          <w:smallCaps/>
-          <w:sz w:val="20"/>
-        </w:rPr>
-        <w:t>IX. Limitations</w:t>
+        <w:t xml:space="preserve">We report this because it constrains the practical claim rather than the scientific one. Script-aware fusion is a large improvement to retrieval, measured as retrieval. It does </w:t>
+      </w:r>
+      <w:r>
+        <w:rPr>
+          <w:rFonts w:ascii="Times New Roman" w:hAnsi="Times New Roman"/>
+          <w:b/>
+          <w:sz w:val="20"/>
+        </w:rPr>
+        <w:t>not</w:t>
+      </w:r>
+      <w:r>
+        <w:rPr>
+          <w:rFonts w:ascii="Times New Roman" w:hAnsi="Times New Roman"/>
+          <w:sz w:val="20"/>
+        </w:rPr>
+        <w:t xml:space="preserve"> produce a measurable improvement in answer quality over dense retrieval alone at this sample size: paired over the questions both arms answered, arm C exceeds arm B by 0.003 token-F1 (p = 0.89) and 0.026 citation support (p = 1.00).</w:t>
       </w:r>
     </w:p>
     <w:p>
@@ -15784,7 +16106,7 @@
           <w:rFonts w:ascii="Times New Roman" w:hAnsi="Times New Roman"/>
           <w:sz w:val="20"/>
         </w:rPr>
-        <w:t>We state these at length, because the value of a result of this kind depends on knowing precisely how far it reaches.</w:t>
+        <w:t>The two facts fit together rather than conflicting. A generator losing 0.597 on its own is a noise floor that a retrieval gain has to clear to become visible downstream, and on 72 questions a gain of this size does not clear it. A reader who cares about end-to-end answer quality should know that fixing retrieval entirely would buy 0.193, while the generator is leaving 0.597 on the table.</w:t>
       </w:r>
     </w:p>
     <w:p>
@@ -15796,17 +16118,23 @@
       <w:r>
         <w:rPr>
           <w:rFonts w:ascii="Times New Roman" w:hAnsi="Times New Roman"/>
-          <w:b/>
-          <w:sz w:val="20"/>
-        </w:rPr>
-        <w:t>The corpus is encyclopedic, not regulatory.</w:t>
-      </w:r>
-      <w:r>
-        <w:rPr>
-          <w:rFonts w:ascii="Times New Roman" w:hAnsi="Times New Roman"/>
-          <w:sz w:val="20"/>
-        </w:rPr>
-        <w:t xml:space="preserve"> Our documents describe Indian government schemes; they are not the scheme guidelines themselves. Sustained attempts to build the corpus from official portals failed on soft 404s and image-only scans — one eighteen-page document yielded seventeen characters of extractable text — and the deviation is documented in the product requirements rather than quietly absorbed. Consequently we make no claim about retrieval over statutory or regulatory Hindi, which differs from encyclopedic Hindi in register, sentence length and terminology. The cross-script retrieval mechanism we identify is a property of the retrievers and the writing systems rather than of the genre, so we expect it to transfer; we have not shown that it does.</w:t>
+          <w:sz w:val="20"/>
+        </w:rPr>
+        <w:t>That ratio is a property of this configuration, not a general law. A 3B model at 4-bit quantization is a deliberately small generator, chosen so every number here is reproducible on commodity hardware, and a larger one would move the 0.597 without touching the 0.193. The point is that the two error sources have to be measured separately before either is optimised, which is precisely what the oracle arm is for and why the brief asks for it.</w:t>
+      </w:r>
+    </w:p>
+    <w:p>
+      <w:pPr>
+        <w:spacing w:before="200" w:after="80"/>
+        <w:jc w:val="left"/>
+      </w:pPr>
+      <w:r>
+        <w:rPr>
+          <w:rFonts w:ascii="Times New Roman" w:hAnsi="Times New Roman"/>
+          <w:i/>
+          <w:sz w:val="20"/>
+        </w:rPr>
+        <w:t>E. Where this generalises</w:t>
       </w:r>
     </w:p>
     <w:p>
@@ -15818,17 +16146,24 @@
       <w:r>
         <w:rPr>
           <w:rFonts w:ascii="Times New Roman" w:hAnsi="Times New Roman"/>
-          <w:b/>
-          <w:sz w:val="20"/>
-        </w:rPr>
-        <w:t>One Indic language.</w:t>
-      </w:r>
-      <w:r>
-        <w:rPr>
-          <w:rFonts w:ascii="Times New Roman" w:hAnsi="Times New Roman"/>
-          <w:sz w:val="20"/>
-        </w:rPr>
-        <w:t xml:space="preserve"> We evaluate Hindi and Hindi–English code-mixing. India has twenty-two scheduled languages, and several of the most widely spoken use scripts other than Devanagari. Script-aware fusion is formulated over an eligibility relation between queries and passages and is not specific to Devanagari, but a two-script corpus cannot distinguish a method that handles script asymmetry in general from one that happens to handle this pair. Behaviour with three or more scripts, and with partially overlapping scripts such as those sharing a Perso-Arabic base, is untested.</w:t>
+          <w:sz w:val="20"/>
+        </w:rPr>
+        <w:t xml:space="preserve">The mechanism is not about Hindi, and it is not about script. It appears wherever rank fusion is applied over retrievers with </w:t>
+      </w:r>
+      <w:r>
+        <w:rPr>
+          <w:rFonts w:ascii="Times New Roman" w:hAnsi="Times New Roman"/>
+          <w:i/>
+          <w:sz w:val="20"/>
+        </w:rPr>
+        <w:t>asymmetric coverage</w:t>
+      </w:r>
+      <w:r>
+        <w:rPr>
+          <w:rFonts w:ascii="Times New Roman" w:hAnsi="Times New Roman"/>
+          <w:sz w:val="20"/>
+        </w:rPr>
+        <w:t xml:space="preserve"> of the collection — where at least one retriever cannot, in principle, return part of what is being searched. Cross-script and cross-language pairs are the case studied here. The same structure arises when fusing a text retriever with one operating over images or tables, where each is blind to the other's modality; when fusing over access-controlled shards, where one retriever is permitted a subset of documents; and when fusing a domain-specialised index with a general one over a collection only partly covered by the specialist.</w:t>
       </w:r>
     </w:p>
     <w:p>
@@ -15840,17 +16175,38 @@
       <w:r>
         <w:rPr>
           <w:rFonts w:ascii="Times New Roman" w:hAnsi="Times New Roman"/>
-          <w:b/>
-          <w:sz w:val="20"/>
-        </w:rPr>
-        <w:t>Scale, and no human annotator.</w:t>
-      </w:r>
-      <w:r>
-        <w:rPr>
-          <w:rFonts w:ascii="Times New Roman" w:hAnsi="Times New Roman"/>
-          <w:sz w:val="20"/>
-        </w:rPr>
-        <w:t xml:space="preserve"> The evaluation set is 393 verified items, of which 313 are answerable, spread over six query-language-by-passage-language cells of 44 to 69 items, and the sealed test split holds 273 of them; per-cell differences of a few points are not resolvable. The larger limitation is who verified them. The protocol called for a person to confirm every item and for a second person to re-label a blind sample, with κ ≥ 0.70 as a gate on reporting any answerability result. Both steps were carried out by a language model instead (§III-D). The second pass agrees perfectly with the first, κ = 1.000 over 59 items, but two instances of one model share its blind spots, and the confirming pass had already dropped the items it disagreed with, so that figure measures consistency and is not the gate the protocol describes. The verification did find and remove real defects — wrong answers, unreadable translations, duplicated unanswerable items — and every figure in §VI rests on the corrected set; but a gold set checked only by a model inherits that model's judgement of what a passage states, and a human pass over at least the test split remains the most valuable single piece of outstanding work.</w:t>
+          <w:sz w:val="20"/>
+        </w:rPr>
+        <w:t xml:space="preserve">The practical guidance is correspondingly simple, and is the form in which we would want this result used: before fusing retrievers, check their </w:t>
+      </w:r>
+      <w:r>
+        <w:rPr>
+          <w:rFonts w:ascii="Times New Roman" w:hAnsi="Times New Roman"/>
+          <w:i/>
+          <w:sz w:val="20"/>
+        </w:rPr>
+        <w:t>coverage</w:t>
+      </w:r>
+      <w:r>
+        <w:rPr>
+          <w:rFonts w:ascii="Times New Roman" w:hAnsi="Times New Roman"/>
+          <w:sz w:val="20"/>
+        </w:rPr>
+        <w:t>, not only their quality. Two retrievers of equal measured accuracy can combine well or destructively depending on whether each could have retrieved what the other did. Where coverage is asymmetric, fusion should be taken over the retrievers eligible for a candidate rather than those that returned it.</w:t>
+      </w:r>
+    </w:p>
+    <w:p>
+      <w:pPr>
+        <w:spacing w:before="200" w:after="80"/>
+        <w:jc w:val="center"/>
+      </w:pPr>
+      <w:r>
+        <w:rPr>
+          <w:rFonts w:ascii="Times New Roman" w:hAnsi="Times New Roman"/>
+          <w:smallCaps/>
+          <w:sz w:val="20"/>
+        </w:rPr>
+        <w:t>IX. Limitations</w:t>
       </w:r>
     </w:p>
     <w:p>
@@ -15862,31 +16218,9 @@
       <w:r>
         <w:rPr>
           <w:rFonts w:ascii="Times New Roman" w:hAnsi="Times New Roman"/>
-          <w:b/>
-          <w:sz w:val="20"/>
-        </w:rPr>
-        <w:t>Probe-set figures are kept, and they disagree with the gold set.</w:t>
-      </w:r>
-      <w:r>
-        <w:rPr>
-          <w:rFonts w:ascii="Times New Roman" w:hAnsi="Times New Roman"/>
-          <w:sz w:val="20"/>
-        </w:rPr>
-        <w:t xml:space="preserve"> The analyses in §VI-B to §VI-F were measured on 180 synthetic probes before the gold set existed, and are marked </w:t>
-      </w:r>
-      <w:r>
-        <w:rPr>
-          <w:rFonts w:ascii="Consolas" w:hAnsi="Consolas"/>
-          <w:sz w:val="17"/>
-        </w:rPr>
-        <w:t>[PROBE]</w:t>
-      </w:r>
-      <w:r>
-        <w:rPr>
-          <w:rFonts w:ascii="Times New Roman" w:hAnsi="Times New Roman"/>
-          <w:sz w:val="20"/>
-        </w:rPr>
-        <w:t>. The direction of the fusion result held on the verified set, as the mechanism predicted; the magnitudes did not. The probes understated the repair to plain fusion and overstated the gain over dense retrieval alone, and one probe-set observation — LaBSE leading the code-mixed slice — does not hold on real questions. Where they disagree, §VI-A stands.</w:t>
+          <w:sz w:val="20"/>
+        </w:rPr>
+        <w:t>We state these at length, because the value of a result of this kind depends on knowing precisely how far it reaches.</w:t>
       </w:r>
     </w:p>
     <w:p>
@@ -15901,14 +16235,14 @@
           <w:b/>
           <w:sz w:val="20"/>
         </w:rPr>
-        <w:t>A small quantized generator on CPU.</w:t>
-      </w:r>
-      <w:r>
-        <w:rPr>
-          <w:rFonts w:ascii="Times New Roman" w:hAnsi="Times New Roman"/>
-          <w:sz w:val="20"/>
-        </w:rPr>
-        <w:t xml:space="preserve"> Generation uses Qwen2.5-3B-Instruct at 4-bit quantization on a four-core CPU. This is a deliberate constraint — the system is intended to be reproducible on commodity hardware, and every figure we report is one a reader can regenerate without a GPU — but it bounds what the question-answering results say. A larger or unquantized model would plausibly change the absolute answer quality figures. It would not change the retrieval results, which are model-independent, and the retrieval results are where our contribution lies.</w:t>
+        <w:t>The corpus is encyclopedic, not regulatory.</w:t>
+      </w:r>
+      <w:r>
+        <w:rPr>
+          <w:rFonts w:ascii="Times New Roman" w:hAnsi="Times New Roman"/>
+          <w:sz w:val="20"/>
+        </w:rPr>
+        <w:t xml:space="preserve"> Our documents describe Indian government schemes; they are not the scheme guidelines themselves. Sustained attempts to build the corpus from official portals failed on soft 404s and image-only scans — one eighteen-page document yielded seventeen characters of extractable text — and the deviation is documented in the product requirements rather than quietly absorbed. Consequently we make no claim about retrieval over statutory or regulatory Hindi, which differs from encyclopedic Hindi in register, sentence length and terminology. The cross-script retrieval mechanism we identify is a property of the retrievers and the writing systems rather than of the genre, so we expect it to transfer; we have not shown that it does.</w:t>
       </w:r>
     </w:p>
     <w:p>
@@ -15923,14 +16257,14 @@
           <w:b/>
           <w:sz w:val="20"/>
         </w:rPr>
-        <w:t>The fusion correction is demonstrated over three encoders, not all of them.</w:t>
-      </w:r>
-      <w:r>
-        <w:rPr>
-          <w:rFonts w:ascii="Times New Roman" w:hAnsi="Times New Roman"/>
-          <w:sz w:val="20"/>
-        </w:rPr>
-        <w:t xml:space="preserve"> §VI-A.1 applies it over multilingual-e5-base, MiniLM-L12 and LaBSE on the verified set, and it improves each (+0.028, +0.162, +0.085), more for the weaker encoders, which is what a claim about the arithmetic rather than the representation predicts. That is evidence for the generalisation in §VIII-E but not proof of it: three sentence encoders on one corpus is a narrow base, and we have not tested the mechanism on the non-language asymmetries §VIII-E claims it reaches.</w:t>
+        <w:t>One Indic language.</w:t>
+      </w:r>
+      <w:r>
+        <w:rPr>
+          <w:rFonts w:ascii="Times New Roman" w:hAnsi="Times New Roman"/>
+          <w:sz w:val="20"/>
+        </w:rPr>
+        <w:t xml:space="preserve"> We evaluate Hindi and Hindi–English code-mixing. India has twenty-two scheduled languages, and several of the most widely spoken use scripts other than Devanagari. Script-aware fusion is formulated over an eligibility relation between queries and passages and is not specific to Devanagari, but a two-script corpus cannot distinguish a method that handles script asymmetry in general from one that happens to handle this pair. Behaviour with three or more scripts, and with partially overlapping scripts such as those sharing a Perso-Arabic base, is untested.</w:t>
       </w:r>
     </w:p>
     <w:p>
@@ -15945,14 +16279,14 @@
           <w:b/>
           <w:sz w:val="20"/>
         </w:rPr>
-        <w:t>Most of our own pre-registered targets were missed.</w:t>
-      </w:r>
-      <w:r>
-        <w:rPr>
-          <w:rFonts w:ascii="Times New Roman" w:hAnsi="Times New Roman"/>
-          <w:sz w:val="20"/>
-        </w:rPr>
-        <w:t xml:space="preserve"> We fixed eight success criteria before collecting any number — retrieval recall by language group, answerability F1, citation support, annotator agreement — and met one of them: that the closed-book arm would sit far below the retrieval arms on citation support. We report this rather than quietly dropping the targets, and two of the misses are informative. The retrieval targets (0.85 monolingual, 0.70 cross-lingual) were set against an imagined corpus of official scheme guidelines, where a question and its answer share vocabulary; they were never recalibrated when that corpus proved unobtainable and an encyclopedic one was substituted, which is an error in our planning rather than in the system. The answerability target of 0.75 was unreachable by the signal it assumed, for the reason §VI-H gives. A target missed because the question changed under it is worth separating from a target missed because the method failed, and these are mostly the former.</w:t>
+        <w:t>Scale, and no human annotator.</w:t>
+      </w:r>
+      <w:r>
+        <w:rPr>
+          <w:rFonts w:ascii="Times New Roman" w:hAnsi="Times New Roman"/>
+          <w:sz w:val="20"/>
+        </w:rPr>
+        <w:t xml:space="preserve"> The evaluation set is 393 verified items, of which 313 are answerable, spread over six query-language-by-passage-language cells of 44 to 69 items, and the sealed test split holds 273 of them; per-cell differences of a few points are not resolvable. The larger limitation is who verified them. The protocol called for a person to confirm every item and for a second person to re-label a blind sample, with κ ≥ 0.70 as a gate on reporting any answerability result. Both steps were carried out by a language model instead (§III-D). The second pass agrees perfectly with the first, κ = 1.000 over 59 items, but two instances of one model share its blind spots, and the confirming pass had already dropped the items it disagreed with, so that figure measures consistency and is not the gate the protocol describes. The verification did find and remove real defects — wrong answers, unreadable translations, duplicated unanswerable items — and every figure in §VI rests on the corrected set; but a gold set checked only by a model inherits that model's judgement of what a passage states, and a human pass over at least the test split remains the most valuable single piece of outstanding work.</w:t>
       </w:r>
     </w:p>
     <w:p>
@@ -15967,14 +16301,28 @@
           <w:b/>
           <w:sz w:val="20"/>
         </w:rPr>
-        <w:t>No component is fine-tuned.</w:t>
-      </w:r>
-      <w:r>
-        <w:rPr>
-          <w:rFonts w:ascii="Times New Roman" w:hAnsi="Times New Roman"/>
-          <w:sz w:val="20"/>
-        </w:rPr>
-        <w:t xml:space="preserve"> All encoders and the generator are used off-the-shelf. Fine-tuning any of them on in-domain data would likely improve absolute numbers, and would confound the comparison we are making, which is between fusion methods holding the retrievers fixed.</w:t>
+        <w:t>Probe-set figures are kept, and they disagree with the gold set.</w:t>
+      </w:r>
+      <w:r>
+        <w:rPr>
+          <w:rFonts w:ascii="Times New Roman" w:hAnsi="Times New Roman"/>
+          <w:sz w:val="20"/>
+        </w:rPr>
+        <w:t xml:space="preserve"> The analyses in §VI-B to §VI-F were measured on 180 synthetic probes before the gold set existed, and are marked </w:t>
+      </w:r>
+      <w:r>
+        <w:rPr>
+          <w:rFonts w:ascii="Consolas" w:hAnsi="Consolas"/>
+          <w:sz w:val="17"/>
+        </w:rPr>
+        <w:t>[PROBE]</w:t>
+      </w:r>
+      <w:r>
+        <w:rPr>
+          <w:rFonts w:ascii="Times New Roman" w:hAnsi="Times New Roman"/>
+          <w:sz w:val="20"/>
+        </w:rPr>
+        <w:t>. The direction of the fusion result held on the verified set, as the mechanism predicted; the magnitudes did not. The probes understated the repair to plain fusion and overstated the gain over dense retrieval alone, and one probe-set observation — LaBSE leading the code-mixed slice — does not hold on real questions. Where they disagree, §VI-A stands.</w:t>
       </w:r>
     </w:p>
     <w:p>
@@ -15989,14 +16337,102 @@
           <w:b/>
           <w:sz w:val="20"/>
         </w:rPr>
-        <w:t>The answerability threshold is a retrieval-side signal, and our negative result about it is bounded by our own taxonomy.</w:t>
-      </w:r>
-      <w:r>
-        <w:rPr>
-          <w:rFonts w:ascii="Times New Roman" w:hAnsi="Times New Roman"/>
-          <w:sz w:val="20"/>
-        </w:rPr>
-        <w:t xml:space="preserve"> We show it carries no information here, but the reason is that 55 of our 80 unanswerable items are written about schemes present in the corpus. A benchmark whose unanswerable questions were predominantly out-of-scope would find the same threshold useful, and the 0.688 recall we measure on that one class shows why. The claim is therefore conditional: retrieval-score thresholds fail on unanswerable questions about </w:t>
+        <w:t>A small quantized generator on CPU.</w:t>
+      </w:r>
+      <w:r>
+        <w:rPr>
+          <w:rFonts w:ascii="Times New Roman" w:hAnsi="Times New Roman"/>
+          <w:sz w:val="20"/>
+        </w:rPr>
+        <w:t xml:space="preserve"> Generation uses Qwen2.5-3B-Instruct at 4-bit quantization on a four-core CPU. This is a deliberate constraint — the system is intended to be reproducible on commodity hardware, and every figure we report is one a reader can regenerate without a GPU — but it bounds what the question-answering results say. A larger or unquantized model would plausibly change the absolute answer quality figures. It would not change the retrieval results, which are model-independent, and the retrieval results are where our contribution lies.</w:t>
+      </w:r>
+    </w:p>
+    <w:p>
+      <w:pPr>
+        <w:spacing w:after="0"/>
+        <w:ind w:firstLine="288"/>
+        <w:jc w:val="both"/>
+      </w:pPr>
+      <w:r>
+        <w:rPr>
+          <w:rFonts w:ascii="Times New Roman" w:hAnsi="Times New Roman"/>
+          <w:b/>
+          <w:sz w:val="20"/>
+        </w:rPr>
+        <w:t>The fusion correction is demonstrated over three encoders, not all of them.</w:t>
+      </w:r>
+      <w:r>
+        <w:rPr>
+          <w:rFonts w:ascii="Times New Roman" w:hAnsi="Times New Roman"/>
+          <w:sz w:val="20"/>
+        </w:rPr>
+        <w:t xml:space="preserve"> §VI-A.1 applies it over multilingual-e5-base, MiniLM-L12 and LaBSE on the verified set, and it improves each (+0.028, +0.162, +0.085), more for the weaker encoders, which is what a claim about the arithmetic rather than the representation predicts. That is evidence for the generalisation in §VIII-E but not proof of it: three sentence encoders on one corpus is a narrow base, and we have not tested the mechanism on the non-language asymmetries §VIII-E claims it reaches.</w:t>
+      </w:r>
+    </w:p>
+    <w:p>
+      <w:pPr>
+        <w:spacing w:after="0"/>
+        <w:ind w:firstLine="288"/>
+        <w:jc w:val="both"/>
+      </w:pPr>
+      <w:r>
+        <w:rPr>
+          <w:rFonts w:ascii="Times New Roman" w:hAnsi="Times New Roman"/>
+          <w:b/>
+          <w:sz w:val="20"/>
+        </w:rPr>
+        <w:t>Most of our own pre-registered targets were missed.</w:t>
+      </w:r>
+      <w:r>
+        <w:rPr>
+          <w:rFonts w:ascii="Times New Roman" w:hAnsi="Times New Roman"/>
+          <w:sz w:val="20"/>
+        </w:rPr>
+        <w:t xml:space="preserve"> We fixed eight success criteria before collecting any number — retrieval recall by language group, answerability F1, citation support, annotator agreement — and met one of them: that the closed-book arm would sit far below the retrieval arms on citation support. We report this rather than quietly dropping the targets, and two of the misses are informative. The retrieval targets (0.85 monolingual, 0.70 cross-lingual) were set against an imagined corpus of official scheme guidelines, where a question and its answer share vocabulary; they were never recalibrated when that corpus proved unobtainable and an encyclopedic one was substituted, which is an error in our planning rather than in the system. The answerability target of 0.75 was unreachable by the signal it assumed, for the reason §VI-H gives. A target missed because the question changed under it is worth separating from a target missed because the method failed, and these are mostly the former.</w:t>
+      </w:r>
+    </w:p>
+    <w:p>
+      <w:pPr>
+        <w:spacing w:after="0"/>
+        <w:ind w:firstLine="288"/>
+        <w:jc w:val="both"/>
+      </w:pPr>
+      <w:r>
+        <w:rPr>
+          <w:rFonts w:ascii="Times New Roman" w:hAnsi="Times New Roman"/>
+          <w:b/>
+          <w:sz w:val="20"/>
+        </w:rPr>
+        <w:t>No component is fine-tuned.</w:t>
+      </w:r>
+      <w:r>
+        <w:rPr>
+          <w:rFonts w:ascii="Times New Roman" w:hAnsi="Times New Roman"/>
+          <w:sz w:val="20"/>
+        </w:rPr>
+        <w:t xml:space="preserve"> All encoders and the generator are used off-the-shelf. Fine-tuning any of them on in-domain data would likely improve absolute numbers, and would confound the comparison we are making, which is between fusion methods holding the retrievers fixed.</w:t>
+      </w:r>
+    </w:p>
+    <w:p>
+      <w:pPr>
+        <w:spacing w:after="0"/>
+        <w:ind w:firstLine="288"/>
+        <w:jc w:val="both"/>
+      </w:pPr>
+      <w:r>
+        <w:rPr>
+          <w:rFonts w:ascii="Times New Roman" w:hAnsi="Times New Roman"/>
+          <w:b/>
+          <w:sz w:val="20"/>
+        </w:rPr>
+        <w:t>The answerability threshold is a retrieval-side signal, and what it can detect is bounded by our taxonomy.</w:t>
+      </w:r>
+      <w:r>
+        <w:rPr>
+          <w:rFonts w:ascii="Times New Roman" w:hAnsi="Times New Roman"/>
+          <w:sz w:val="20"/>
+        </w:rPr>
+        <w:t xml:space="preserve"> On the verified set a BM25 top-score threshold is a usable first-stage filter (§VI-H), but its strength is uneven by class: it rejects every out-of-scope question on the test split and only 0.522 of near-misses. Since 55 of our 80 unanswerable items are written about schemes present in the corpus, the aggregate F1 depends on that mix. A benchmark whose unanswerable questions were predominantly out-of-scope would find the threshold far stronger, and one made entirely of near-misses would find it close to useless. We report per-class recall for that reason, and we evaluate the generator's own abstention and an entailment check alongside it, since those read the passage and are the signals that can see a missing </w:t>
       </w:r>
       <w:r>
         <w:rPr>
@@ -16004,14 +16440,14 @@
           <w:i/>
           <w:sz w:val="20"/>
         </w:rPr>
-        <w:t>present</w:t>
-      </w:r>
-      <w:r>
-        <w:rPr>
-          <w:rFonts w:ascii="Times New Roman" w:hAnsi="Times New Roman"/>
-          <w:sz w:val="20"/>
-        </w:rPr>
-        <w:t xml:space="preserve"> topics, which we argue is the deployment-relevant case for a system fielding questions about schemes it documents, but we have not shown they fail in general. We evaluate a natural-language-inference signal alongside, which addresses exactly the classes the threshold cannot see.</w:t>
+        <w:t>fact</w:t>
+      </w:r>
+      <w:r>
+        <w:rPr>
+          <w:rFonts w:ascii="Times New Roman" w:hAnsi="Times New Roman"/>
+          <w:sz w:val="20"/>
+        </w:rPr>
+        <w:t xml:space="preserve"> rather than a missing topic.</w:t>
       </w:r>
     </w:p>
     <w:p>

</xml_diff>

<commit_message>
Add a 6-page IEEE conference version beside the full paper
paper/ieee.md condenses the paper to conference length; build-docx.py --ieee
--pdf writes IndicRAG-QA-IEEE.docx and .pdf (6 pages, 6 tables, 5 figures)
and never touches the full paper, which stays the source of record. Every
number is from the verified test split, and the verification is described as
it happened: by a language model, not a person.

Condensing surfaced four errors in the full paper, fixed here: §II-D still
said retrieval scores carry no answerability signal; Table II gave design
counts (near-miss 30, false premise 15) rather than verified ones (29, 16);
§V-C still called the test split 280 items; and slide 9 credited the +0.133
gain over dense retrieval to the probes, when it came from the unverified set.
</commit_message>
<xml_diff>
--- a/paper/IndicRAG-QA.docx
+++ b/paper/IndicRAG-QA.docx
@@ -909,7 +909,7 @@
           <w:rFonts w:ascii="Times New Roman" w:hAnsi="Times New Roman"/>
           <w:sz w:val="20"/>
         </w:rPr>
-        <w:t xml:space="preserve"> in the corpus, and those retrieve exactly as well as answerable questions do. A retrieval-score threshold is a corpus-absence detector, so it can only see the 25 out-of-scope items, and over the stratified set it carries no information at all — answerable and unanswerable medians of 13.55 and 13.82 under BM25, with precision pinned at the base rate across every threshold. A single F1 over an undifferentiated unanswerable class hides that completely. The contribution is the stratified measurement, not the observation that hard unanswerable questions exist.</w:t>
+        <w:t xml:space="preserve"> in the corpus. A BM25 threshold rejects every out-of-scope question on our test split and only 0.522 of near-misses, whose passages are genuinely about the right scheme; a single F1 over an undifferentiated unanswerable class hides that. The contribution is the stratified measurement, not the observation that hard unanswerable questions exist.</w:t>
       </w:r>
     </w:p>
     <w:p>
@@ -2853,7 +2853,7 @@
           <w:b/>
           <w:sz w:val="20"/>
         </w:rPr>
-        <w:t>TABLE II — Unanswerable taxonomy</w:t>
+        <w:t>TABLE II — Unanswerable taxonomy (verified; design target in parentheses)</w:t>
       </w:r>
     </w:p>
     <w:tbl>
@@ -2968,7 +2968,7 @@
                 <w:rFonts w:ascii="Times New Roman" w:hAnsi="Times New Roman"/>
                 <w:sz w:val="16"/>
               </w:rPr>
-              <w:t>25</w:t>
+              <w:t>25 (25)</w:t>
             </w:r>
           </w:p>
         </w:tc>
@@ -3037,7 +3037,7 @@
                 <w:rFonts w:ascii="Times New Roman" w:hAnsi="Times New Roman"/>
                 <w:sz w:val="16"/>
               </w:rPr>
-              <w:t>30</w:t>
+              <w:t>29 (30)</w:t>
             </w:r>
           </w:p>
         </w:tc>
@@ -3106,7 +3106,7 @@
                 <w:rFonts w:ascii="Times New Roman" w:hAnsi="Times New Roman"/>
                 <w:sz w:val="16"/>
               </w:rPr>
-              <w:t>15</w:t>
+              <w:t>16 (15)</w:t>
             </w:r>
           </w:p>
         </w:tc>
@@ -3174,7 +3174,7 @@
                 <w:rFonts w:ascii="Times New Roman" w:hAnsi="Times New Roman"/>
                 <w:sz w:val="16"/>
               </w:rPr>
-              <w:t>10</w:t>
+              <w:t>10 (10)</w:t>
             </w:r>
           </w:p>
         </w:tc>
@@ -6782,14 +6782,14 @@
           <w:b/>
           <w:sz w:val="20"/>
         </w:rPr>
-        <w:t>280-item test split</w:t>
-      </w:r>
-      <w:r>
-        <w:rPr>
-          <w:rFonts w:ascii="Times New Roman" w:hAnsi="Times New Roman"/>
-          <w:sz w:val="20"/>
-        </w:rPr>
-        <w:t>, stratified over query language, answerability and scheme, with seed 20260922. Stratification matters because an unstratified split leaves some cell of Table I with a handful of test items, and a per-language result computed on a handful of items reports noise with the appearance of authority.</w:t>
+        <w:t>test split</w:t>
+      </w:r>
+      <w:r>
+        <w:rPr>
+          <w:rFonts w:ascii="Times New Roman" w:hAnsi="Times New Roman"/>
+          <w:sz w:val="20"/>
+        </w:rPr>
+        <w:t xml:space="preserve"> — 280 items as designed, 273 after verification removed 7 — stratified over query language, answerability and scheme, with seed 20260922. Stratification matters because an unstratified split leaves some cell of Table I with a handful of test items, and a per-language result computed on a handful of items reports noise with the appearance of authority.</w:t>
       </w:r>
     </w:p>
     <w:p>

</xml_diff>